<commit_message>
fix: actualiza informe y PDF final de Fase 1
Se reemplaza el informe DOCX y su versión PDF de la Fase 1 con las correcciones finales solicitadas en la rúbrica. Se ajusta la coherencia entre informe, notebook, README y requirements.txt, actualizando objetivo general, versiones del entorno, alcance real de la fase y componentes implementados/proyectados.
</commit_message>
<xml_diff>
--- a/F1/docs/f1_s01_evaluacion_entregable_grupo6.docx
+++ b/F1/docs/f1_s01_evaluacion_entregable_grupo6.docx
@@ -7611,82 +7611,14 @@
           <w:lang w:val="es-CL"/>
         </w:rPr>
       </w:pPr>
-      <w:r>
-        <w:rPr>
-          <w:rFonts w:cs="Calibri"/>
-          <w:b/>
-          <w:bCs/>
-          <w:color w:val="auto"/>
-          <w:lang w:val="es-CL"/>
-        </w:rPr>
-        <w:lastRenderedPageBreak/>
-        <w:t xml:space="preserve">Manejo Científico de la Nulidad y Preparación de Modelos con </w:t>
-      </w:r>
       <w:proofErr w:type="spellStart"/>
-      <w:r>
-        <w:rPr>
-          <w:rFonts w:cs="Calibri"/>
-          <w:b/>
-          <w:bCs/>
-          <w:color w:val="auto"/>
-          <w:lang w:val="es-CL"/>
-        </w:rPr>
-        <w:t>Scikit-Learn</w:t>
-      </w:r>
       <w:proofErr w:type="spellEnd"/>
-      <w:r>
-        <w:rPr>
-          <w:rFonts w:cs="Calibri"/>
-          <w:b/>
-          <w:bCs/>
-          <w:color w:val="auto"/>
-          <w:lang w:val="es-CL"/>
-        </w:rPr>
-        <w:t>:</w:t>
-      </w:r>
-      <w:r>
-        <w:rPr>
-          <w:rFonts w:cs="Calibri"/>
-          <w:color w:val="auto"/>
-          <w:lang w:val="es-CL"/>
-        </w:rPr>
-        <w:t xml:space="preserve"> El tratamiento avanzado de los vacíos informacionales en </w:t>
-      </w:r>
       <w:proofErr w:type="spellStart"/>
-      <w:r>
-        <w:rPr>
-          <w:rFonts w:cs="Calibri"/>
-          <w:color w:val="auto"/>
-          <w:lang w:val="es-CL"/>
-        </w:rPr>
-        <w:t>Insulin</w:t>
-      </w:r>
       <w:proofErr w:type="spellEnd"/>
-      <w:r>
-        <w:rPr>
-          <w:rFonts w:cs="Calibri"/>
-          <w:color w:val="auto"/>
-          <w:lang w:val="es-CL"/>
-        </w:rPr>
-        <w:t xml:space="preserve"> y </w:t>
-      </w:r>
       <w:proofErr w:type="spellStart"/>
-      <w:r>
-        <w:rPr>
-          <w:rFonts w:cs="Calibri"/>
-          <w:color w:val="auto"/>
-          <w:lang w:val="es-CL"/>
-        </w:rPr>
-        <w:t>SkinThickness</w:t>
-      </w:r>
       <w:proofErr w:type="spellEnd"/>
       <w:r>
-        <w:rPr>
-          <w:rFonts w:cs="Calibri"/>
-          <w:color w:val="auto"/>
-          <w:lang w:val="es-CL"/>
-        </w:rPr>
-        <w:t xml:space="preserve"> requiere enfoques estadísticos sofisticados (como la imputación por vecindad KNN o modelos bayesianos) que no alteren la distribución empírica original de la muestra (Pedregosa et al., 2011). Las herramientas convencionales suelen forzar el reemplazo manual por cero o por medias aritméticas simples, lo que destruye la varianza, artificialmente reduce la desviación estándar e introduce sesgos severos en el espacio de características. Contar con un entorno programático estructurado permite evaluar el impacto de la imputación mediante el análisis de correlaciones y distribuciones visuales antes de que los tensores alimenten a los algoritmos de aprendizaje automático. </w:t>
+        <w:t>Manejo Científico de la Nulidad y Preparación de Fases Posteriores: El tratamiento avanzado de los vacíos informacionales en Insulin y SkinThickness requerirá enfoques estadísticos que no alteren la distribución empírica original de la muestra. Estas acciones no se ejecutan en la Fase 1; quedan proyectadas para fases posteriores, una vez documentada la línea base de nulos, duplicados y distribución de Outcome. Este criterio permite evitar intervenciones prematuras sobre el archivo crudo y mantiene la trazabilidad del diagnóstico inicial.</w:t>
       </w:r>
     </w:p>
     <w:p>
@@ -8167,97 +8099,16 @@
                 <w:lang w:val="es-CL"/>
               </w:rPr>
             </w:pPr>
-            <w:r>
-              <w:rPr>
-                <w:rFonts w:cs="Calibri"/>
-                <w:b/>
-                <w:bCs/>
-                <w:color w:val="auto"/>
-                <w:lang w:val="es-CL"/>
-              </w:rPr>
-              <w:t>Establecimiento de la Línea Base Analítica:</w:t>
-            </w:r>
-            <w:r>
-              <w:rPr>
-                <w:rFonts w:cs="Calibri"/>
-                <w:color w:val="auto"/>
-                <w:lang w:val="es-CL"/>
-              </w:rPr>
-              <w:t xml:space="preserve"> Mediante un diseño programático imperativo y lineal, se extrae la data aislando el entorno de ejecución. Su aporte crítico consiste en generar una "radiografía de degradación" sin alterar la matriz original, identificando visual y cuantitativamente los conflictos de esquema (como </w:t>
-            </w:r>
             <w:proofErr w:type="spellStart"/>
-            <w:r>
-              <w:rPr>
-                <w:rFonts w:cs="Calibri"/>
-                <w:color w:val="auto"/>
-                <w:lang w:val="es-CL"/>
-              </w:rPr>
-              <w:t>BloodPressure</w:t>
-            </w:r>
             <w:proofErr w:type="spellEnd"/>
-            <w:r>
-              <w:rPr>
-                <w:rFonts w:cs="Calibri"/>
-                <w:color w:val="auto"/>
-                <w:lang w:val="es-CL"/>
-              </w:rPr>
-              <w:t xml:space="preserve"> mapeada como </w:t>
-            </w:r>
             <w:proofErr w:type="spellStart"/>
-            <w:r>
-              <w:rPr>
-                <w:rFonts w:cs="Calibri"/>
-                <w:i/>
-                <w:iCs/>
-                <w:color w:val="auto"/>
-                <w:lang w:val="es-CL"/>
-              </w:rPr>
-              <w:t>object</w:t>
-            </w:r>
             <w:proofErr w:type="spellEnd"/>
-            <w:r>
-              <w:rPr>
-                <w:rFonts w:cs="Calibri"/>
-                <w:color w:val="auto"/>
-                <w:lang w:val="es-CL"/>
-              </w:rPr>
-              <w:t xml:space="preserve">) y los vacíos informacionales en las variables </w:t>
-            </w:r>
             <w:proofErr w:type="spellStart"/>
-            <w:r>
-              <w:rPr>
-                <w:rFonts w:cs="Calibri"/>
-                <w:color w:val="auto"/>
-                <w:lang w:val="es-CL"/>
-              </w:rPr>
-              <w:t>Insulin</w:t>
-            </w:r>
             <w:proofErr w:type="spellEnd"/>
-            <w:r>
-              <w:rPr>
-                <w:rFonts w:cs="Calibri"/>
-                <w:color w:val="auto"/>
-                <w:lang w:val="es-CL"/>
-              </w:rPr>
-              <w:t xml:space="preserve"> y Skin </w:t>
-            </w:r>
             <w:proofErr w:type="spellStart"/>
-            <w:r>
-              <w:rPr>
-                <w:rFonts w:cs="Calibri"/>
-                <w:color w:val="auto"/>
-                <w:lang w:val="es-CL"/>
-              </w:rPr>
-              <w:t>Thickness</w:t>
-            </w:r>
             <w:proofErr w:type="spellEnd"/>
             <w:r>
-              <w:rPr>
-                <w:rFonts w:cs="Calibri"/>
-                <w:color w:val="auto"/>
-                <w:lang w:val="es-CL"/>
-              </w:rPr>
-              <w:t>. A partir de este flujo secuencial, se definen los requerimientos de entrada obligatorios para la posterior fase de transformación.</w:t>
+              <w:t>Establecimiento de la Línea Base Analítica: Mediante un diseño programático imperativo y lineal, se extrae la data aislando el entorno de ejecución. Su aporte crítico consiste en generar una radiografía de degradación sin alterar la matriz original, identificando de forma nominal y cuantitativa los conflictos de esquema, los valores faltantes, los duplicados exactos y la distribución de Outcome. A partir de este flujo secuencial, se definen los requerimientos de entrada obligatorios para la posterior fase de transformación.</w:t>
             </w:r>
           </w:p>
         </w:tc>
@@ -8533,22 +8384,7 @@
               </w:rPr>
             </w:pPr>
             <w:r>
-              <w:rPr>
-                <w:rFonts w:cs="Calibri"/>
-                <w:b/>
-                <w:bCs/>
-                <w:color w:val="auto"/>
-                <w:lang w:val="es-CL"/>
-              </w:rPr>
-              <w:t>Extracción de Patrones e Inferencia Analítica:</w:t>
-            </w:r>
-            <w:r>
-              <w:rPr>
-                <w:rFonts w:cs="Calibri"/>
-                <w:color w:val="auto"/>
-                <w:lang w:val="es-CL"/>
-              </w:rPr>
-              <w:t xml:space="preserve"> Utiliza la matriz de datos purificada y normalizada en la Fase 2 para alimentar algoritmos como la Regresión Logística ya importada en el entorno científico. Al estar libre de ruido estadístico, el optimizador matemático converge eficientemente. El aporte clave es entrenar modelos capaces de generalizar la probabilidad de prevalencia del síndrome diabético a partir de los atributos demográfico-clínicos de los pacientes. </w:t>
+              <w:t>Extracción de Patrones e Inferencia Analítica: En fases posteriores, especialmente en F3, la matriz de datos previamente limpiada y normalizada podrá alimentar algoritmos de clasificación, como regresión logística u otros modelos supervisados. Este componente no forma parte de la ejecución de Fase 1, ya que depende de que F2 entregue una base validada y sin inconsistencias críticas. Su aporte proyectado será entrenar modelos capaces de estimar la probabilidad de prevalencia del síndrome diabético a partir de atributos demográfico-clínicos.</w:t>
             </w:r>
           </w:p>
         </w:tc>
@@ -10019,23 +9855,7 @@
         </w:rPr>
       </w:pPr>
       <w:r>
-        <w:rPr>
-          <w:rFonts w:cs="Calibri"/>
-          <w:b/>
-          <w:bCs/>
-          <w:color w:val="auto"/>
-          <w:lang w:val="es-CL"/>
-        </w:rPr>
-        <w:lastRenderedPageBreak/>
-        <w:t>Ejecución Lineal y Secuencial Orientada a Celdas:</w:t>
-      </w:r>
-      <w:r>
-        <w:rPr>
-          <w:rFonts w:cs="Calibri"/>
-          <w:color w:val="auto"/>
-          <w:lang w:val="es-CL"/>
-        </w:rPr>
-        <w:t xml:space="preserve"> En lugar de complejizar el flujo con estructuras abstractas de clases, la gobernanza y auditoría de datos en su etapa inicial demanda un flujo programático directo, transparente y secuencial. Esto permite la inspección inmediata del estado de la memoria RAM tras cada transformación elemental en el notebook.</w:t>
+        <w:t>Ejecución Lineal y Secuencial Orientada a Celdas: En lugar de complejizar el flujo con estructuras abstractas de clases, la gobernanza y auditoría de datos en su etapa inicial demanda un flujo programático directo, transparente y secuencial. Esto permite la inspección inmediata del estado de la memoria RAM tras cada bloque de diagnóstico ejecutado en el notebook, sin realizar limpieza, imputación ni transformación de datos en Fase 1.</w:t>
       </w:r>
     </w:p>
     <w:p>
@@ -11114,41 +10934,10 @@
           <w:lang w:val="es-CL"/>
         </w:rPr>
       </w:pPr>
-      <w:r>
-        <w:rPr>
-          <w:rFonts w:cs="Calibri"/>
-          <w:b/>
-          <w:bCs/>
-          <w:color w:val="auto"/>
-          <w:lang w:val="es-CL"/>
-        </w:rPr>
-        <w:t>Auditoría de Asimetría del Target:</w:t>
-      </w:r>
-      <w:r>
-        <w:rPr>
-          <w:rFonts w:cs="Calibri"/>
-          <w:color w:val="auto"/>
-          <w:lang w:val="es-CL"/>
-        </w:rPr>
-        <w:t xml:space="preserve"> Diagnóstico probabilístico y representación visual de la distribución empírica de la clase objetivo </w:t>
-      </w:r>
       <w:proofErr w:type="spellStart"/>
-      <w:r>
-        <w:rPr>
-          <w:rFonts w:cs="Calibri"/>
-          <w:color w:val="auto"/>
-          <w:lang w:val="es-CL"/>
-        </w:rPr>
-        <w:t>Outcome</w:t>
-      </w:r>
       <w:proofErr w:type="spellEnd"/>
       <w:r>
-        <w:rPr>
-          <w:rFonts w:cs="Calibri"/>
-          <w:color w:val="auto"/>
-          <w:lang w:val="es-CL"/>
-        </w:rPr>
-        <w:t xml:space="preserve"> para documentar la tasa de prevalencia real de la muestra. </w:t>
+        <w:t>Auditoría de Asimetría del Target: Diagnóstico tabular de la distribución empírica de la clase objetivo Outcome para documentar la tasa de prevalencia real de la muestra. En Fase 1 este análisis se limita al conteo absoluto y porcentual de clases, sin generar visualizaciones exploratorias.</w:t>
       </w:r>
     </w:p>
     <w:p>
@@ -12334,127 +12123,16 @@
           <w:lang w:val="es-CL"/>
         </w:rPr>
       </w:pPr>
-      <w:r>
-        <w:rPr>
-          <w:rFonts w:cs="Calibri"/>
-          <w:color w:val="auto"/>
-          <w:lang w:val="es-CL"/>
-        </w:rPr>
-        <w:t xml:space="preserve">La ejecución de una auditoría analítica y el perfilado estático inicial sobre la matriz de datos de </w:t>
-      </w:r>
-      <w:r>
-        <w:rPr>
-          <w:rFonts w:cs="Calibri"/>
-          <w:i/>
-          <w:iCs/>
-          <w:color w:val="auto"/>
-          <w:lang w:val="es-CL"/>
-        </w:rPr>
-        <w:t>diabetes_raw.csv</w:t>
-      </w:r>
-      <w:r>
-        <w:rPr>
-          <w:rFonts w:cs="Calibri"/>
-          <w:color w:val="auto"/>
-          <w:lang w:val="es-CL"/>
-        </w:rPr>
-        <w:t xml:space="preserve"> requiere la integración de un ecosistema de software robusto, estandarizado y maduro. En lugar de implementar rutinas de programación aisladas, el desarrollo del proyecto se apoya en el </w:t>
-      </w:r>
       <w:proofErr w:type="spellStart"/>
-      <w:r>
-        <w:rPr>
-          <w:rFonts w:cs="Calibri"/>
-          <w:color w:val="auto"/>
-          <w:lang w:val="es-CL"/>
-        </w:rPr>
-        <w:t>stack</w:t>
-      </w:r>
       <w:proofErr w:type="spellEnd"/>
-      <w:r>
-        <w:rPr>
-          <w:rFonts w:cs="Calibri"/>
-          <w:color w:val="auto"/>
-          <w:lang w:val="es-CL"/>
-        </w:rPr>
-        <w:t xml:space="preserve"> científico nativo de Python, compuesto por las librerías </w:t>
-      </w:r>
-      <w:r>
-        <w:rPr>
-          <w:rFonts w:cs="Calibri"/>
-          <w:b/>
-          <w:bCs/>
-          <w:color w:val="auto"/>
-          <w:lang w:val="es-CL"/>
-        </w:rPr>
-        <w:t>Pandas</w:t>
-      </w:r>
-      <w:r>
-        <w:rPr>
-          <w:rFonts w:cs="Calibri"/>
-          <w:color w:val="auto"/>
-          <w:lang w:val="es-CL"/>
-        </w:rPr>
-        <w:t xml:space="preserve">, </w:t>
-      </w:r>
       <w:proofErr w:type="spellStart"/>
-      <w:r>
-        <w:rPr>
-          <w:rFonts w:cs="Calibri"/>
-          <w:b/>
-          <w:bCs/>
-          <w:color w:val="auto"/>
-          <w:lang w:val="es-CL"/>
-        </w:rPr>
-        <w:t>NumPy</w:t>
-      </w:r>
       <w:proofErr w:type="spellEnd"/>
-      <w:r>
-        <w:rPr>
-          <w:rFonts w:cs="Calibri"/>
-          <w:color w:val="auto"/>
-          <w:lang w:val="es-CL"/>
-        </w:rPr>
-        <w:t xml:space="preserve">, </w:t>
-      </w:r>
       <w:proofErr w:type="spellStart"/>
-      <w:r>
-        <w:rPr>
-          <w:rFonts w:cs="Calibri"/>
-          <w:b/>
-          <w:bCs/>
-          <w:color w:val="auto"/>
-          <w:lang w:val="es-CL"/>
-        </w:rPr>
-        <w:t>Matplotlib</w:t>
-      </w:r>
       <w:proofErr w:type="spellEnd"/>
-      <w:r>
-        <w:rPr>
-          <w:rFonts w:cs="Calibri"/>
-          <w:color w:val="auto"/>
-          <w:lang w:val="es-CL"/>
-        </w:rPr>
-        <w:t xml:space="preserve"> y </w:t>
-      </w:r>
       <w:proofErr w:type="spellStart"/>
-      <w:r>
-        <w:rPr>
-          <w:rFonts w:cs="Calibri"/>
-          <w:b/>
-          <w:bCs/>
-          <w:color w:val="auto"/>
-          <w:lang w:val="es-CL"/>
-        </w:rPr>
-        <w:t>Seaborn</w:t>
-      </w:r>
       <w:proofErr w:type="spellEnd"/>
       <w:r>
-        <w:rPr>
-          <w:rFonts w:cs="Calibri"/>
-          <w:color w:val="auto"/>
-          <w:lang w:val="es-CL"/>
-        </w:rPr>
-        <w:t xml:space="preserve">. Esta suite tecnológica actúa como una infraestructura integrada de gobernanza de datos, permitiendo transitar de manera controlada desde la extracción de flujos crudos en disco hasta la generación de representaciones estadísticas multidimensionales de alta fidelidad. </w:t>
+        <w:t>La ejecución de una auditoría analítica y el perfilado estático inicial sobre la matriz de datos diabetes_raw.csv requiere la integración de un ecosistema de software robusto, estandarizado y verificable. En lugar de implementar rutinas manuales o dependientes de hojas de cálculo, el desarrollo del proyecto se apoya en el stack científico realmente utilizado en la Fase 1: Python 3.12.4, Pandas 2.2.2, NumPy 1.26.4, ipykernel 6.28.0, notebook 7.0.8 y JupyterLab 4.0.11. Esta selección permite cargar, inspeccionar y auditar el dataset crudo de manera reproducible, manteniendo la trazabilidad entre el notebook, el requirements.txt y el repositorio GitHub.</w:t>
       </w:r>
     </w:p>
     <w:p>
@@ -12468,12 +12146,7 @@
         </w:rPr>
       </w:pPr>
       <w:r>
-        <w:rPr>
-          <w:rFonts w:cs="Calibri"/>
-          <w:color w:val="auto"/>
-          <w:lang w:val="es-CL"/>
-        </w:rPr>
-        <w:t>A continuación, se justifica técnicamente el rol y la relevancia computacional de cada herramienta seleccionada en el pipeline de la Fase 1:</w:t>
+        <w:t>A continuación, se justifica técnicamente el rol y la relevancia computacional de cada herramienta efectivamente utilizada en el flujo de auditoría inicial de la Fase 1:</w:t>
       </w:r>
     </w:p>
     <w:p>
@@ -12489,444 +12162,40 @@
           <w:lang w:val="es-CL"/>
         </w:rPr>
       </w:pPr>
-      <w:r>
-        <w:rPr>
-          <w:rFonts w:cs="Calibri"/>
-          <w:b/>
-          <w:bCs/>
-          <w:color w:val="auto"/>
-          <w:lang w:val="es-CL"/>
-        </w:rPr>
-        <w:t>Pandas (Data-</w:t>
-      </w:r>
       <w:proofErr w:type="spellStart"/>
-      <w:r>
-        <w:rPr>
-          <w:rFonts w:cs="Calibri"/>
-          <w:b/>
-          <w:bCs/>
-          <w:color w:val="auto"/>
-          <w:lang w:val="es-CL"/>
-        </w:rPr>
-        <w:t>driven</w:t>
-      </w:r>
       <w:proofErr w:type="spellEnd"/>
-      <w:r>
-        <w:rPr>
-          <w:rFonts w:cs="Calibri"/>
-          <w:b/>
-          <w:bCs/>
-          <w:color w:val="auto"/>
-          <w:lang w:val="es-CL"/>
-        </w:rPr>
-        <w:t xml:space="preserve"> </w:t>
-      </w:r>
       <w:proofErr w:type="spellStart"/>
-      <w:r>
-        <w:rPr>
-          <w:rFonts w:cs="Calibri"/>
-          <w:b/>
-          <w:bCs/>
-          <w:color w:val="auto"/>
-          <w:lang w:val="es-CL"/>
-        </w:rPr>
-        <w:t>Abstraction</w:t>
-      </w:r>
       <w:proofErr w:type="spellEnd"/>
-      <w:r>
-        <w:rPr>
-          <w:rFonts w:cs="Calibri"/>
-          <w:b/>
-          <w:bCs/>
-          <w:color w:val="auto"/>
-          <w:lang w:val="es-CL"/>
-        </w:rPr>
-        <w:t>):</w:t>
-      </w:r>
-      <w:r>
-        <w:rPr>
-          <w:rFonts w:cs="Calibri"/>
-          <w:color w:val="auto"/>
-          <w:lang w:val="es-CL"/>
-        </w:rPr>
-        <w:t xml:space="preserve"> El núcleo de la manipulación estructural y la ingesta segura reside en esta librería, fundamentada en el objeto </w:t>
-      </w:r>
       <w:proofErr w:type="spellStart"/>
       <w:proofErr w:type="gramStart"/>
-      <w:r>
-        <w:rPr>
-          <w:rFonts w:cs="Calibri"/>
-          <w:color w:val="auto"/>
-          <w:lang w:val="es-CL"/>
-        </w:rPr>
-        <w:t>DataFrame</w:t>
-      </w:r>
-      <w:proofErr w:type="spellEnd"/>
-      <w:r>
-        <w:rPr>
-          <w:rFonts w:cs="Calibri"/>
-          <w:color w:val="auto"/>
-          <w:lang w:val="es-CL"/>
-        </w:rPr>
-        <w:t xml:space="preserve"> .</w:t>
-      </w:r>
-      <w:proofErr w:type="gramEnd"/>
-      <w:r>
-        <w:rPr>
-          <w:rFonts w:cs="Calibri"/>
-          <w:color w:val="auto"/>
-          <w:lang w:val="es-CL"/>
-        </w:rPr>
-        <w:t xml:space="preserve"> Pandas proporciona una capa de abstracción sobre los datos crudos, permitiendo mapear la volumetría de </w:t>
-      </w:r>
-      <w:r>
-        <w:rPr>
-          <w:rFonts w:cs="Calibri"/>
-          <w:b/>
-          <w:bCs/>
-          <w:color w:val="auto"/>
-          <w:lang w:val="es-CL"/>
-        </w:rPr>
-        <w:t>2045</w:t>
-      </w:r>
-      <w:r>
-        <w:rPr>
-          <w:rFonts w:cs="Calibri"/>
-          <w:color w:val="auto"/>
-          <w:lang w:val="es-CL"/>
-        </w:rPr>
-        <w:t xml:space="preserve"> observaciones </w:t>
-      </w:r>
-      <w:r>
-        <w:rPr>
-          <w:rFonts w:cs="Calibri"/>
-          <w:b/>
-          <w:bCs/>
-          <w:color w:val="auto"/>
-          <w:lang w:val="es-CL"/>
-        </w:rPr>
-        <w:t>9</w:t>
-      </w:r>
-      <w:r>
-        <w:rPr>
-          <w:rFonts w:cs="Calibri"/>
-          <w:color w:val="auto"/>
-          <w:lang w:val="es-CL"/>
-        </w:rPr>
-        <w:t xml:space="preserve"> columnas mediante métodos eficientes de bajo nivel </w:t>
-      </w:r>
-      <w:proofErr w:type="gramStart"/>
-      <w:r>
-        <w:rPr>
-          <w:rFonts w:cs="Calibri"/>
-          <w:color w:val="auto"/>
-          <w:lang w:val="es-CL"/>
-        </w:rPr>
-        <w:t xml:space="preserve">como </w:t>
-      </w:r>
-      <w:r>
-        <w:rPr>
-          <w:rFonts w:cs="Calibri"/>
-          <w:i/>
-          <w:iCs/>
-          <w:color w:val="auto"/>
-          <w:lang w:val="es-CL"/>
-        </w:rPr>
-        <w:t>.</w:t>
-      </w:r>
-      <w:proofErr w:type="spellStart"/>
-      <w:r>
-        <w:rPr>
-          <w:rFonts w:cs="Calibri"/>
-          <w:i/>
-          <w:iCs/>
-          <w:color w:val="auto"/>
-          <w:lang w:val="es-CL"/>
-        </w:rPr>
-        <w:t>shape</w:t>
-      </w:r>
       <w:proofErr w:type="spellEnd"/>
       <w:proofErr w:type="gramEnd"/>
-      <w:r>
-        <w:rPr>
-          <w:rFonts w:cs="Calibri"/>
-          <w:color w:val="auto"/>
-          <w:lang w:val="es-CL"/>
-        </w:rPr>
-        <w:t xml:space="preserve">, </w:t>
-      </w:r>
-      <w:r>
-        <w:rPr>
-          <w:rFonts w:cs="Calibri"/>
-          <w:i/>
-          <w:iCs/>
-          <w:color w:val="auto"/>
-          <w:lang w:val="es-CL"/>
-        </w:rPr>
-        <w:t>.</w:t>
-      </w:r>
+      <w:proofErr w:type="gramStart"/>
       <w:proofErr w:type="spellStart"/>
-      <w:r>
-        <w:rPr>
-          <w:rFonts w:cs="Calibri"/>
-          <w:i/>
-          <w:iCs/>
-          <w:color w:val="auto"/>
-          <w:lang w:val="es-CL"/>
-        </w:rPr>
-        <w:t>dtypes</w:t>
-      </w:r>
       <w:proofErr w:type="spellEnd"/>
-      <w:r>
-        <w:rPr>
-          <w:rFonts w:cs="Calibri"/>
-          <w:color w:val="auto"/>
-          <w:lang w:val="es-CL"/>
-        </w:rPr>
-        <w:t xml:space="preserve"> e </w:t>
-      </w:r>
-      <w:r>
-        <w:rPr>
-          <w:rFonts w:cs="Calibri"/>
-          <w:i/>
-          <w:iCs/>
-          <w:color w:val="auto"/>
-          <w:lang w:val="es-CL"/>
-        </w:rPr>
-        <w:t>.</w:t>
-      </w:r>
+      <w:proofErr w:type="gramEnd"/>
       <w:proofErr w:type="spellStart"/>
-      <w:r>
-        <w:rPr>
-          <w:rFonts w:cs="Calibri"/>
-          <w:i/>
-          <w:iCs/>
-          <w:color w:val="auto"/>
-          <w:lang w:val="es-CL"/>
-        </w:rPr>
-        <w:t>info</w:t>
-      </w:r>
       <w:proofErr w:type="spellEnd"/>
-      <w:r>
-        <w:rPr>
-          <w:rFonts w:cs="Calibri"/>
-          <w:i/>
-          <w:iCs/>
-          <w:color w:val="auto"/>
-          <w:lang w:val="es-CL"/>
-        </w:rPr>
-        <w:t>()</w:t>
-      </w:r>
-      <w:r>
-        <w:rPr>
-          <w:rFonts w:cs="Calibri"/>
-          <w:color w:val="auto"/>
-          <w:lang w:val="es-CL"/>
-        </w:rPr>
-        <w:t xml:space="preserve"> . En el desarrollo del notebook, Pandas demostró ser crítico para la gobernanza al revelar que el motor de </w:t>
-      </w:r>
       <w:proofErr w:type="spellStart"/>
-      <w:r>
-        <w:rPr>
-          <w:rFonts w:cs="Calibri"/>
-          <w:color w:val="auto"/>
-          <w:lang w:val="es-CL"/>
-        </w:rPr>
-        <w:t>parsing</w:t>
-      </w:r>
       <w:proofErr w:type="spellEnd"/>
-      <w:r>
-        <w:rPr>
-          <w:rFonts w:cs="Calibri"/>
-          <w:color w:val="auto"/>
-          <w:lang w:val="es-CL"/>
-        </w:rPr>
-        <w:t xml:space="preserve"> degradó la columna continua </w:t>
-      </w:r>
       <w:proofErr w:type="spellStart"/>
-      <w:r>
-        <w:rPr>
-          <w:rFonts w:cs="Calibri"/>
-          <w:color w:val="auto"/>
-          <w:lang w:val="es-CL"/>
-        </w:rPr>
-        <w:t>BloodPressure</w:t>
-      </w:r>
       <w:proofErr w:type="spellEnd"/>
-      <w:r>
-        <w:rPr>
-          <w:rFonts w:cs="Calibri"/>
-          <w:color w:val="auto"/>
-          <w:lang w:val="es-CL"/>
-        </w:rPr>
-        <w:t xml:space="preserve"> a tipo </w:t>
-      </w:r>
+      <w:proofErr w:type="spellStart"/>
+      <w:proofErr w:type="spellEnd"/>
       <w:proofErr w:type="spellStart"/>
       <w:proofErr w:type="gramStart"/>
-      <w:r>
-        <w:rPr>
-          <w:rFonts w:cs="Calibri"/>
-          <w:color w:val="auto"/>
-          <w:lang w:val="es-CL"/>
-        </w:rPr>
-        <w:t>object</w:t>
-      </w:r>
-      <w:proofErr w:type="spellEnd"/>
-      <w:r>
-        <w:rPr>
-          <w:rFonts w:cs="Calibri"/>
-          <w:color w:val="auto"/>
-          <w:lang w:val="es-CL"/>
-        </w:rPr>
-        <w:t xml:space="preserve"> .</w:t>
-      </w:r>
-      <w:proofErr w:type="gramEnd"/>
-      <w:r>
-        <w:rPr>
-          <w:rFonts w:cs="Calibri"/>
-          <w:color w:val="auto"/>
-          <w:lang w:val="es-CL"/>
-        </w:rPr>
-        <w:t xml:space="preserve"> Asimismo, la ejecución matricial </w:t>
-      </w:r>
-      <w:proofErr w:type="gramStart"/>
-      <w:r>
-        <w:rPr>
-          <w:rFonts w:cs="Calibri"/>
-          <w:color w:val="auto"/>
-          <w:lang w:val="es-CL"/>
-        </w:rPr>
-        <w:t xml:space="preserve">de </w:t>
-      </w:r>
-      <w:r>
-        <w:rPr>
-          <w:rFonts w:cs="Calibri"/>
-          <w:i/>
-          <w:iCs/>
-          <w:color w:val="auto"/>
-          <w:lang w:val="es-CL"/>
-        </w:rPr>
-        <w:t>.</w:t>
-      </w:r>
-      <w:proofErr w:type="spellStart"/>
-      <w:r>
-        <w:rPr>
-          <w:rFonts w:cs="Calibri"/>
-          <w:i/>
-          <w:iCs/>
-          <w:color w:val="auto"/>
-          <w:lang w:val="es-CL"/>
-        </w:rPr>
-        <w:t>isnull</w:t>
-      </w:r>
       <w:proofErr w:type="spellEnd"/>
       <w:proofErr w:type="gramEnd"/>
-      <w:r>
-        <w:rPr>
-          <w:rFonts w:cs="Calibri"/>
-          <w:i/>
-          <w:iCs/>
-          <w:color w:val="auto"/>
-          <w:lang w:val="es-CL"/>
-        </w:rPr>
-        <w:t>().sum()</w:t>
-      </w:r>
-      <w:r>
-        <w:rPr>
-          <w:rFonts w:cs="Calibri"/>
-          <w:color w:val="auto"/>
-          <w:lang w:val="es-CL"/>
-        </w:rPr>
-        <w:t xml:space="preserve"> permitió aislar el vector de pérdidas exactas de la muestra, localizando con precisión matemática los </w:t>
-      </w:r>
-      <w:r>
-        <w:rPr>
-          <w:rFonts w:cs="Calibri"/>
-          <w:b/>
-          <w:bCs/>
-          <w:color w:val="auto"/>
-          <w:lang w:val="es-CL"/>
-        </w:rPr>
-        <w:t>164</w:t>
-      </w:r>
-      <w:r>
-        <w:rPr>
-          <w:rFonts w:cs="Calibri"/>
-          <w:color w:val="auto"/>
-          <w:lang w:val="es-CL"/>
-        </w:rPr>
-        <w:t xml:space="preserve"> valores faltantes de </w:t>
-      </w:r>
+      <w:proofErr w:type="gramStart"/>
       <w:proofErr w:type="spellStart"/>
-      <w:r>
-        <w:rPr>
-          <w:rFonts w:cs="Calibri"/>
-          <w:color w:val="auto"/>
-          <w:lang w:val="es-CL"/>
-        </w:rPr>
-        <w:t>SkinThickness</w:t>
-      </w:r>
       <w:proofErr w:type="spellEnd"/>
-      <w:r>
-        <w:rPr>
-          <w:rFonts w:cs="Calibri"/>
-          <w:color w:val="auto"/>
-          <w:lang w:val="es-CL"/>
-        </w:rPr>
-        <w:t xml:space="preserve"> y los </w:t>
-      </w:r>
-      <w:r>
-        <w:rPr>
-          <w:rFonts w:cs="Calibri"/>
-          <w:b/>
-          <w:bCs/>
-          <w:color w:val="auto"/>
-          <w:lang w:val="es-CL"/>
-        </w:rPr>
-        <w:t>245</w:t>
-      </w:r>
-      <w:r>
-        <w:rPr>
-          <w:rFonts w:cs="Calibri"/>
-          <w:color w:val="auto"/>
-          <w:lang w:val="es-CL"/>
-        </w:rPr>
-        <w:t xml:space="preserve"> de </w:t>
-      </w:r>
+      <w:proofErr w:type="gramEnd"/>
       <w:proofErr w:type="spellStart"/>
-      <w:r>
-        <w:rPr>
-          <w:rFonts w:cs="Calibri"/>
-          <w:color w:val="auto"/>
-          <w:lang w:val="es-CL"/>
-        </w:rPr>
-        <w:t>Insulin</w:t>
-      </w:r>
       <w:proofErr w:type="spellEnd"/>
-      <w:r>
-        <w:rPr>
-          <w:rFonts w:cs="Calibri"/>
-          <w:color w:val="auto"/>
-          <w:lang w:val="es-CL"/>
-        </w:rPr>
-        <w:t>. Esta capacidad de perfilado estático establece una restricción estricta para la futura Fase 2, asegurando que las anomalías queden completamente documentadas antes de aplicar transformaciones</w:t>
-      </w:r>
-      <w:r>
-        <w:rPr>
-          <w:rStyle w:val="Refdenotaalpie"/>
-          <w:rFonts w:cs="Calibri"/>
-          <w:color w:val="auto"/>
-          <w:lang w:val="es-CL"/>
-        </w:rPr>
-        <w:footnoteReference w:id="7"/>
-      </w:r>
-      <w:r>
-        <w:rPr>
-          <w:rFonts w:cs="Calibri"/>
-          <w:color w:val="auto"/>
-          <w:lang w:val="es-CL"/>
-        </w:rPr>
-        <w:t xml:space="preserve"> (McKinney, 2010). </w:t>
+      <w:proofErr w:type="spellStart"/>
+      <w:proofErr w:type="spellEnd"/>
+      <w:r>
+        <w:t>Pandas (Data-driven Abstraction): El núcleo de la manipulación estructural y la ingesta segura reside en esta librería, fundamentada en el objeto DataFrame. Pandas proporciona una capa de abstracción sobre los datos crudos, permitiendo mapear la volumetría de 2045 observaciones y 9 columnas mediante métodos eficientes como .shape, .dtypes e .info(). En el desarrollo del notebook, Pandas permite documentar la estructura inicial del dataset, verificar los tipos de datos, revisar las primeras observaciones y calcular indicadores básicos de calidad, tales como valores faltantes, duplicados exactos y distribución de la variable objetivo Outcome. Esta capacidad de perfilado estático establece una restricción estricta para la futura Fase 2, asegurando que las anomalías queden documentadas antes de aplicar transformaciones (McKinney, 2010).</w:t>
       </w:r>
     </w:p>
     <w:p>
@@ -12943,255 +12212,27 @@
         </w:rPr>
       </w:pPr>
       <w:proofErr w:type="spellStart"/>
-      <w:r>
-        <w:rPr>
-          <w:rFonts w:cs="Calibri"/>
-          <w:b/>
-          <w:bCs/>
-          <w:color w:val="auto"/>
-          <w:lang w:val="es-CL"/>
-        </w:rPr>
-        <w:t>NumPy</w:t>
-      </w:r>
       <w:proofErr w:type="spellEnd"/>
-      <w:r>
-        <w:rPr>
-          <w:rFonts w:cs="Calibri"/>
-          <w:b/>
-          <w:bCs/>
-          <w:color w:val="auto"/>
-          <w:lang w:val="es-CL"/>
-        </w:rPr>
-        <w:t xml:space="preserve"> (</w:t>
-      </w:r>
       <w:proofErr w:type="spellStart"/>
-      <w:r>
-        <w:rPr>
-          <w:rFonts w:cs="Calibri"/>
-          <w:b/>
-          <w:bCs/>
-          <w:color w:val="auto"/>
-          <w:lang w:val="es-CL"/>
-        </w:rPr>
-        <w:t>Numerical</w:t>
-      </w:r>
       <w:proofErr w:type="spellEnd"/>
-      <w:r>
-        <w:rPr>
-          <w:rFonts w:cs="Calibri"/>
-          <w:b/>
-          <w:bCs/>
-          <w:color w:val="auto"/>
-          <w:lang w:val="es-CL"/>
-        </w:rPr>
-        <w:t xml:space="preserve"> </w:t>
-      </w:r>
       <w:proofErr w:type="spellStart"/>
-      <w:r>
-        <w:rPr>
-          <w:rFonts w:cs="Calibri"/>
-          <w:b/>
-          <w:bCs/>
-          <w:color w:val="auto"/>
-          <w:lang w:val="es-CL"/>
-        </w:rPr>
-        <w:t>Vectorization</w:t>
-      </w:r>
       <w:proofErr w:type="spellEnd"/>
-      <w:r>
-        <w:rPr>
-          <w:rFonts w:cs="Calibri"/>
-          <w:b/>
-          <w:bCs/>
-          <w:color w:val="auto"/>
-          <w:lang w:val="es-CL"/>
-        </w:rPr>
-        <w:t xml:space="preserve"> </w:t>
-      </w:r>
       <w:proofErr w:type="spellStart"/>
-      <w:r>
-        <w:rPr>
-          <w:rFonts w:cs="Calibri"/>
-          <w:b/>
-          <w:bCs/>
-          <w:color w:val="auto"/>
-          <w:lang w:val="es-CL"/>
-        </w:rPr>
-        <w:t>backend</w:t>
-      </w:r>
       <w:proofErr w:type="spellEnd"/>
-      <w:r>
-        <w:rPr>
-          <w:rFonts w:cs="Calibri"/>
-          <w:b/>
-          <w:bCs/>
-          <w:color w:val="auto"/>
-          <w:lang w:val="es-CL"/>
-        </w:rPr>
-        <w:t>):</w:t>
-      </w:r>
-      <w:r>
-        <w:rPr>
-          <w:rFonts w:cs="Calibri"/>
-          <w:color w:val="auto"/>
-          <w:lang w:val="es-CL"/>
-        </w:rPr>
-        <w:t xml:space="preserve"> Aunque el analista interactúa principalmente con las interfaces de Pandas, la eficiencia del procesamiento descansa sobre el </w:t>
-      </w:r>
       <w:proofErr w:type="spellStart"/>
-      <w:r>
-        <w:rPr>
-          <w:rFonts w:cs="Calibri"/>
-          <w:color w:val="auto"/>
-          <w:lang w:val="es-CL"/>
-        </w:rPr>
-        <w:t>backend</w:t>
-      </w:r>
       <w:proofErr w:type="spellEnd"/>
-      <w:r>
-        <w:rPr>
-          <w:rFonts w:cs="Calibri"/>
-          <w:color w:val="auto"/>
-          <w:lang w:val="es-CL"/>
-        </w:rPr>
-        <w:t xml:space="preserve"> vectorizado de </w:t>
-      </w:r>
       <w:proofErr w:type="spellStart"/>
-      <w:r>
-        <w:rPr>
-          <w:rFonts w:cs="Calibri"/>
-          <w:color w:val="auto"/>
-          <w:lang w:val="es-CL"/>
-        </w:rPr>
-        <w:t>NumPy</w:t>
-      </w:r>
       <w:proofErr w:type="spellEnd"/>
-      <w:r>
-        <w:rPr>
-          <w:rFonts w:cs="Calibri"/>
-          <w:color w:val="auto"/>
-          <w:lang w:val="es-CL"/>
-        </w:rPr>
-        <w:t xml:space="preserve">. Al almacenar los datos en bloques contiguos de memoria de tipo </w:t>
-      </w:r>
       <w:proofErr w:type="spellStart"/>
-      <w:r>
-        <w:rPr>
-          <w:rFonts w:cs="Calibri"/>
-          <w:color w:val="auto"/>
-          <w:lang w:val="es-CL"/>
-        </w:rPr>
-        <w:t>ndarray</w:t>
-      </w:r>
       <w:proofErr w:type="spellEnd"/>
-      <w:r>
-        <w:rPr>
-          <w:rFonts w:cs="Calibri"/>
-          <w:color w:val="auto"/>
-          <w:lang w:val="es-CL"/>
-        </w:rPr>
-        <w:t xml:space="preserve">, </w:t>
-      </w:r>
       <w:proofErr w:type="spellStart"/>
-      <w:r>
-        <w:rPr>
-          <w:rFonts w:cs="Calibri"/>
-          <w:color w:val="auto"/>
-          <w:lang w:val="es-CL"/>
-        </w:rPr>
-        <w:t>NumPy</w:t>
-      </w:r>
       <w:proofErr w:type="spellEnd"/>
-      <w:r>
-        <w:rPr>
-          <w:rFonts w:cs="Calibri"/>
-          <w:color w:val="auto"/>
-          <w:lang w:val="es-CL"/>
-        </w:rPr>
-        <w:t xml:space="preserve"> elimina la necesidad de emplear bucles iterativos tradicionales de Python, reduciendo la complejidad computacional de </w:t>
-      </w:r>
-      <w:r>
-        <w:rPr>
-          <w:rFonts w:cs="Calibri"/>
-          <w:b/>
-          <w:bCs/>
-          <w:color w:val="auto"/>
-          <w:lang w:val="es-CL"/>
-        </w:rPr>
-        <w:t>O(N)</w:t>
-      </w:r>
-      <w:r>
-        <w:rPr>
-          <w:rFonts w:cs="Calibri"/>
-          <w:color w:val="auto"/>
-          <w:lang w:val="es-CL"/>
-        </w:rPr>
-        <w:t xml:space="preserve"> a </w:t>
-      </w:r>
       <w:proofErr w:type="gramStart"/>
-      <w:r>
-        <w:rPr>
-          <w:rFonts w:cs="Calibri"/>
-          <w:b/>
-          <w:bCs/>
-          <w:color w:val="auto"/>
-          <w:lang w:val="es-CL"/>
-        </w:rPr>
-        <w:t>O(</w:t>
-      </w:r>
       <w:proofErr w:type="gramEnd"/>
-      <w:r>
-        <w:rPr>
-          <w:rFonts w:cs="Calibri"/>
-          <w:b/>
-          <w:bCs/>
-          <w:color w:val="auto"/>
-          <w:lang w:val="es-CL"/>
-        </w:rPr>
-        <w:t>1)</w:t>
-      </w:r>
-      <w:r>
-        <w:rPr>
-          <w:rFonts w:cs="Calibri"/>
-          <w:color w:val="auto"/>
-          <w:lang w:val="es-CL"/>
-        </w:rPr>
-        <w:t xml:space="preserve"> a nivel de elemento mediante la vectorización (Harris et al., 2020)</w:t>
-      </w:r>
-      <w:r>
-        <w:rPr>
-          <w:rStyle w:val="Refdenotaalpie"/>
-          <w:rFonts w:cs="Calibri"/>
-          <w:color w:val="auto"/>
-          <w:lang w:val="es-CL"/>
-        </w:rPr>
-        <w:footnoteReference w:id="8"/>
-      </w:r>
-      <w:r>
-        <w:rPr>
-          <w:rFonts w:cs="Calibri"/>
-          <w:color w:val="auto"/>
-          <w:lang w:val="es-CL"/>
-        </w:rPr>
-        <w:t xml:space="preserve">. En esta fase diagnóstica, </w:t>
-      </w:r>
       <w:proofErr w:type="spellStart"/>
-      <w:r>
-        <w:rPr>
-          <w:rFonts w:cs="Calibri"/>
-          <w:color w:val="auto"/>
-          <w:lang w:val="es-CL"/>
-        </w:rPr>
-        <w:t>NumPy</w:t>
-      </w:r>
       <w:proofErr w:type="spellEnd"/>
       <w:r>
-        <w:rPr>
-          <w:rFonts w:cs="Calibri"/>
-          <w:color w:val="auto"/>
-          <w:lang w:val="es-CL"/>
-        </w:rPr>
-        <w:t xml:space="preserve"> da soporte a las operaciones lógicas y estadísticas que determinan la tipificación nativa de los atributos de la matriz (int64 y float64). Esto garantiza que las propiedades algebraicas del tensor se mantengan invariantes y optimizadas para el rendimiento en memoria RAM. </w:t>
+        <w:t>NumPy (Numerical Vectorization backend): Aunque el análisis se ejecuta principalmente desde las interfaces de Pandas, NumPy constituye el soporte numérico base del ecosistema científico de Python. En esta fase diagnóstica, su uso respalda la representación eficiente de arreglos y tipos numéricos, además de entregar consistencia con las operaciones vectorizadas utilizadas por Pandas. Su inclusión en el entorno garantiza compatibilidad con el procesamiento tabular y con las etapas posteriores de análisis numérico, sin implicar todavía modelamiento predictivo ni transformación avanzada de datos (Harris et al., 2020).</w:t>
       </w:r>
     </w:p>
     <w:p>
@@ -13218,213 +12259,29 @@
         </w:rPr>
       </w:pPr>
       <w:proofErr w:type="spellStart"/>
-      <w:r>
-        <w:rPr>
-          <w:rFonts w:cs="Calibri"/>
-          <w:b/>
-          <w:bCs/>
-          <w:color w:val="auto"/>
-          <w:lang w:val="es-CL"/>
-        </w:rPr>
-        <w:lastRenderedPageBreak/>
-        <w:t>Matplotlib</w:t>
-      </w:r>
       <w:proofErr w:type="spellEnd"/>
-      <w:r>
-        <w:rPr>
-          <w:rFonts w:cs="Calibri"/>
-          <w:b/>
-          <w:bCs/>
-          <w:color w:val="auto"/>
-          <w:lang w:val="es-CL"/>
-        </w:rPr>
-        <w:t xml:space="preserve"> (Low-</w:t>
-      </w:r>
       <w:proofErr w:type="spellStart"/>
-      <w:r>
-        <w:rPr>
-          <w:rFonts w:cs="Calibri"/>
-          <w:b/>
-          <w:bCs/>
-          <w:color w:val="auto"/>
-          <w:lang w:val="es-CL"/>
-        </w:rPr>
-        <w:t>level</w:t>
-      </w:r>
       <w:proofErr w:type="spellEnd"/>
-      <w:r>
-        <w:rPr>
-          <w:rFonts w:cs="Calibri"/>
-          <w:b/>
-          <w:bCs/>
-          <w:color w:val="auto"/>
-          <w:lang w:val="es-CL"/>
-        </w:rPr>
-        <w:t xml:space="preserve"> </w:t>
-      </w:r>
       <w:proofErr w:type="spellStart"/>
-      <w:r>
-        <w:rPr>
-          <w:rFonts w:cs="Calibri"/>
-          <w:b/>
-          <w:bCs/>
-          <w:color w:val="auto"/>
-          <w:lang w:val="es-CL"/>
-        </w:rPr>
-        <w:t>Graphic</w:t>
-      </w:r>
       <w:proofErr w:type="spellEnd"/>
-      <w:r>
-        <w:rPr>
-          <w:rFonts w:cs="Calibri"/>
-          <w:b/>
-          <w:bCs/>
-          <w:color w:val="auto"/>
-          <w:lang w:val="es-CL"/>
-        </w:rPr>
-        <w:t xml:space="preserve"> </w:t>
-      </w:r>
       <w:proofErr w:type="spellStart"/>
-      <w:r>
-        <w:rPr>
-          <w:rFonts w:cs="Calibri"/>
-          <w:b/>
-          <w:bCs/>
-          <w:color w:val="auto"/>
-          <w:lang w:val="es-CL"/>
-        </w:rPr>
-        <w:t>Engine</w:t>
-      </w:r>
       <w:proofErr w:type="spellEnd"/>
-      <w:r>
-        <w:rPr>
-          <w:rFonts w:cs="Calibri"/>
-          <w:b/>
-          <w:bCs/>
-          <w:color w:val="auto"/>
-          <w:lang w:val="es-CL"/>
-        </w:rPr>
-        <w:t>):</w:t>
-      </w:r>
-      <w:r>
-        <w:rPr>
-          <w:rFonts w:cs="Calibri"/>
-          <w:color w:val="auto"/>
-          <w:lang w:val="es-CL"/>
-        </w:rPr>
-        <w:t xml:space="preserve"> Actúa como el motor gráfico base del entorno científico (Hunter, 2007). En el notebook, </w:t>
-      </w:r>
       <w:proofErr w:type="spellStart"/>
-      <w:r>
-        <w:rPr>
-          <w:rFonts w:cs="Calibri"/>
-          <w:color w:val="auto"/>
-          <w:lang w:val="es-CL"/>
-        </w:rPr>
-        <w:t>Matplotlib</w:t>
-      </w:r>
       <w:proofErr w:type="spellEnd"/>
-      <w:r>
-        <w:rPr>
-          <w:rFonts w:cs="Calibri"/>
-          <w:color w:val="auto"/>
-          <w:lang w:val="es-CL"/>
-        </w:rPr>
-        <w:t xml:space="preserve"> proporciona el lienzo estructural y el control dimensional de los gráficos estadísticos a través del submódulo </w:t>
-      </w:r>
       <w:proofErr w:type="spellStart"/>
-      <w:r>
-        <w:rPr>
-          <w:rFonts w:cs="Calibri"/>
-          <w:color w:val="auto"/>
-          <w:lang w:val="es-CL"/>
-        </w:rPr>
-        <w:t>pyplot</w:t>
-      </w:r>
       <w:proofErr w:type="spellEnd"/>
-      <w:r>
-        <w:rPr>
-          <w:rFonts w:cs="Calibri"/>
-          <w:color w:val="auto"/>
-          <w:lang w:val="es-CL"/>
-        </w:rPr>
-        <w:t xml:space="preserve">. Su implementación fue clave para orquestar la visualización masiva de las variables continuas mediante la función </w:t>
-      </w:r>
       <w:proofErr w:type="spellStart"/>
       <w:proofErr w:type="gramStart"/>
-      <w:r>
-        <w:rPr>
-          <w:rFonts w:cs="Calibri"/>
-          <w:color w:val="auto"/>
-          <w:lang w:val="es-CL"/>
-        </w:rPr>
-        <w:t>df.hist</w:t>
-      </w:r>
       <w:proofErr w:type="spellEnd"/>
       <w:proofErr w:type="gramEnd"/>
-      <w:r>
-        <w:rPr>
-          <w:rFonts w:cs="Calibri"/>
-          <w:color w:val="auto"/>
-          <w:lang w:val="es-CL"/>
-        </w:rPr>
-        <w:t>(</w:t>
-      </w:r>
       <w:proofErr w:type="spellStart"/>
-      <w:r>
-        <w:rPr>
-          <w:rFonts w:cs="Calibri"/>
-          <w:color w:val="auto"/>
-          <w:lang w:val="es-CL"/>
-        </w:rPr>
-        <w:t>figsize</w:t>
-      </w:r>
       <w:proofErr w:type="spellEnd"/>
-      <w:r>
-        <w:rPr>
-          <w:rFonts w:cs="Calibri"/>
-          <w:color w:val="auto"/>
-          <w:lang w:val="es-CL"/>
-        </w:rPr>
-        <w:t xml:space="preserve">=(15,10), </w:t>
-      </w:r>
       <w:proofErr w:type="spellStart"/>
-      <w:r>
-        <w:rPr>
-          <w:rFonts w:cs="Calibri"/>
-          <w:color w:val="auto"/>
-          <w:lang w:val="es-CL"/>
-        </w:rPr>
-        <w:t>bins</w:t>
-      </w:r>
       <w:proofErr w:type="spellEnd"/>
-      <w:r>
-        <w:rPr>
-          <w:rFonts w:cs="Calibri"/>
-          <w:color w:val="auto"/>
-          <w:lang w:val="es-CL"/>
-        </w:rPr>
-        <w:t>=20), la cual generó de forma simultánea los histogramas de distribución empírica para identificar sesgos visuales y asimetrías en los indicadores clínicos del paciente. Adicionalmente, sus rutinas internas controlan la disposición formal de los paneles (</w:t>
-      </w:r>
       <w:proofErr w:type="spellStart"/>
-      <w:r>
-        <w:rPr>
-          <w:rFonts w:cs="Calibri"/>
-          <w:i/>
-          <w:iCs/>
-          <w:color w:val="auto"/>
-          <w:lang w:val="es-CL"/>
-        </w:rPr>
-        <w:t>subplots</w:t>
-      </w:r>
       <w:proofErr w:type="spellEnd"/>
       <w:r>
-        <w:rPr>
-          <w:rFonts w:cs="Calibri"/>
-          <w:color w:val="auto"/>
-          <w:lang w:val="es-CL"/>
-        </w:rPr>
-        <w:t xml:space="preserve">) que permiten comparar de forma ordenada el comportamiento marginal de las características. </w:t>
+        <w:t>Herramientas de visualización (proyección para Fase 2): Matplotlib y Seaborn no forman parte de la ejecución operativa del notebook de Fase 1 ni del archivo requirements.txt actual, porque en esta etapa no se generan histogramas, gráficos exploratorios ni visualizaciones avanzadas. Estas librerías quedan proyectadas para fases posteriores, especialmente para el análisis exploratorio y la comunicación visual de resultados una vez que el dataset haya sido limpiado y validado (Hunter, 2007; Waskom, 2021).</w:t>
       </w:r>
     </w:p>
     <w:p>
@@ -13455,12 +12312,7 @@
         </w:rPr>
       </w:pPr>
       <w:r>
-        <w:rPr>
-          <w:rFonts w:cs="Calibri"/>
-          <w:color w:val="auto"/>
-          <w:lang w:val="es-CL"/>
-        </w:rPr>
-        <w:t>La integración sinérgica de estas cuatro herramientas conforma una solución guiada por evidencia. Al operar bajo una arquitectura unificada, se previene la manipulación manual de los archivos y se garantiza que el diagnóstico de calidad sea completamente auditable. Los metadatos extraídos por este ecosistema en el notebook científico constituyen el insumo formal que justifica la ingeniería de características posterior, asegurando la reproducibilidad del flujo desde el primer hito del proyecto.</w:t>
+        <w:t>La integración de estas herramientas conforma una solución guiada por evidencia y acotada al alcance de Fase 1. Al operar con versiones estables y verificadas, se previene la manipulación manual de archivos y se garantiza que el diagnóstico de calidad sea auditable. Los metadatos extraídos por el notebook científico constituyen el insumo formal que justifica las decisiones posteriores de limpieza, imputación, transformación y modelamiento en las siguientes fases del proyecto.</w:t>
       </w:r>
     </w:p>
     <w:p>
@@ -13544,10 +12396,7 @@
         </w:rPr>
       </w:pPr>
       <w:r>
-        <w:rPr>
-          <w:lang w:val="es-CL"/>
-        </w:rPr>
-        <w:t>A continuación, se detallan y justifican técnicamente las funciones globales e imperativas implementadas, las cuales estructuran el flujo secuencial del programa:</w:t>
+        <w:t>A continuación, se detallan y justifican técnicamente las funciones globales y bloques secuenciales efectivamente implementados en el notebook F1_Definicion.ipynb:</w:t>
       </w:r>
     </w:p>
     <w:p>
@@ -13562,75 +12411,15 @@
         </w:rPr>
       </w:pPr>
       <w:proofErr w:type="spellStart"/>
-      <w:r>
-        <w:rPr>
-          <w:b/>
-          <w:bCs/>
-          <w:lang w:val="es-CL"/>
-        </w:rPr>
-        <w:lastRenderedPageBreak/>
-        <w:t>Verificar_entorno_</w:t>
-      </w:r>
       <w:proofErr w:type="gramStart"/>
-      <w:r>
-        <w:rPr>
-          <w:b/>
-          <w:bCs/>
-          <w:lang w:val="es-CL"/>
-        </w:rPr>
-        <w:t>reproducible</w:t>
-      </w:r>
       <w:proofErr w:type="spellEnd"/>
-      <w:r>
-        <w:rPr>
-          <w:b/>
-          <w:bCs/>
-          <w:lang w:val="es-CL"/>
-        </w:rPr>
-        <w:t>(</w:t>
-      </w:r>
       <w:proofErr w:type="gramEnd"/>
-      <w:r>
-        <w:rPr>
-          <w:b/>
-          <w:bCs/>
-          <w:lang w:val="es-CL"/>
-        </w:rPr>
-        <w:t>):</w:t>
-      </w:r>
-      <w:r>
-        <w:rPr>
-          <w:lang w:val="es-CL"/>
-        </w:rPr>
-        <w:t xml:space="preserve"> Esta función interroga directamente al intérprete de Python y al </w:t>
-      </w:r>
       <w:proofErr w:type="spellStart"/>
-      <w:r>
-        <w:rPr>
-          <w:lang w:val="es-CL"/>
-        </w:rPr>
-        <w:t>backend</w:t>
-      </w:r>
       <w:proofErr w:type="spellEnd"/>
-      <w:r>
-        <w:rPr>
-          <w:lang w:val="es-CL"/>
-        </w:rPr>
-        <w:t xml:space="preserve"> del sistema operativo para extraer las versiones exactas de las librerías científicas activas en el </w:t>
-      </w:r>
       <w:proofErr w:type="spellStart"/>
-      <w:r>
-        <w:rPr>
-          <w:lang w:val="es-CL"/>
-        </w:rPr>
-        <w:t>Kernel</w:t>
-      </w:r>
       <w:proofErr w:type="spellEnd"/>
       <w:r>
-        <w:rPr>
-          <w:lang w:val="es-CL"/>
-        </w:rPr>
-        <w:t xml:space="preserve">. Su rol es generar un registro automatizado de trazabilidad computacional, mitigando el riesgo de incompatibilidad de dependencias y actuando como la primera barrera de control técnico del software. </w:t>
+        <w:t>obtener_version(paquete): Esta función consulta las versiones instaladas de las dependencias declaradas para Fase 1. Su rol es generar una evidencia reproducible del entorno real de ejecución, mitigando inconsistencias entre el notebook, el archivo requirements.txt y el equipo donde se replica el proyecto.</w:t>
       </w:r>
     </w:p>
     <w:p>
@@ -13645,168 +12434,23 @@
         </w:rPr>
       </w:pPr>
       <w:proofErr w:type="spellStart"/>
-      <w:r>
-        <w:rPr>
-          <w:b/>
-          <w:bCs/>
-          <w:lang w:val="es-CL"/>
-        </w:rPr>
-        <w:t>Ejecutar_ingesta</w:t>
-      </w:r>
       <w:proofErr w:type="spellEnd"/>
-      <w:r>
-        <w:rPr>
-          <w:b/>
-          <w:bCs/>
-          <w:lang w:val="es-CL"/>
-        </w:rPr>
-        <w:t>(</w:t>
-      </w:r>
       <w:proofErr w:type="spellStart"/>
-      <w:r>
-        <w:rPr>
-          <w:b/>
-          <w:bCs/>
-          <w:lang w:val="es-CL"/>
-        </w:rPr>
-        <w:t>ruta_datos</w:t>
-      </w:r>
       <w:proofErr w:type="spellEnd"/>
-      <w:r>
-        <w:rPr>
-          <w:b/>
-          <w:bCs/>
-          <w:lang w:val="es-CL"/>
-        </w:rPr>
-        <w:t>):</w:t>
-      </w:r>
-      <w:r>
-        <w:rPr>
-          <w:lang w:val="es-CL"/>
-        </w:rPr>
-        <w:t xml:space="preserve"> Diseñado como un bloque funcional tolerante a fallos, se encarga de la extracción segura del archivo CSV. Su valor radica en el manejo robusto de excepciones de Entrada/Salida </w:t>
-      </w:r>
-      <w:r>
-        <w:rPr>
-          <w:i/>
-          <w:iCs/>
-          <w:lang w:val="es-CL"/>
-        </w:rPr>
-        <w:t>(I/O</w:t>
-      </w:r>
       <w:proofErr w:type="gramStart"/>
-      <w:r>
-        <w:rPr>
-          <w:i/>
-          <w:iCs/>
-          <w:lang w:val="es-CL"/>
-        </w:rPr>
-        <w:t>)</w:t>
-      </w:r>
-      <w:r>
-        <w:rPr>
-          <w:lang w:val="es-CL"/>
-        </w:rPr>
-        <w:t xml:space="preserve"> ;</w:t>
-      </w:r>
       <w:proofErr w:type="gramEnd"/>
-      <w:r>
-        <w:rPr>
-          <w:lang w:val="es-CL"/>
-        </w:rPr>
-        <w:t xml:space="preserve"> antes de invocar al </w:t>
-      </w:r>
       <w:proofErr w:type="spellStart"/>
-      <w:r>
-        <w:rPr>
-          <w:lang w:val="es-CL"/>
-        </w:rPr>
-        <w:t>parser</w:t>
-      </w:r>
       <w:proofErr w:type="spellEnd"/>
-      <w:r>
-        <w:rPr>
-          <w:lang w:val="es-CL"/>
-        </w:rPr>
-        <w:t xml:space="preserve"> de Pandas, la función valida la existencia física del archivo, capturando cualquier anomalía de forma controlada </w:t>
-      </w:r>
-      <w:r>
-        <w:rPr>
-          <w:i/>
-          <w:iCs/>
-          <w:lang w:val="es-CL"/>
-        </w:rPr>
-        <w:t>(</w:t>
-      </w:r>
       <w:proofErr w:type="spellStart"/>
-      <w:r>
-        <w:rPr>
-          <w:i/>
-          <w:iCs/>
-          <w:lang w:val="es-CL"/>
-        </w:rPr>
-        <w:t>except</w:t>
-      </w:r>
       <w:proofErr w:type="spellEnd"/>
-      <w:r>
-        <w:rPr>
-          <w:i/>
-          <w:iCs/>
-          <w:lang w:val="es-CL"/>
-        </w:rPr>
-        <w:t xml:space="preserve"> </w:t>
-      </w:r>
       <w:proofErr w:type="spellStart"/>
-      <w:r>
-        <w:rPr>
-          <w:i/>
-          <w:iCs/>
-          <w:lang w:val="es-CL"/>
-        </w:rPr>
-        <w:t>Exception</w:t>
-      </w:r>
       <w:proofErr w:type="spellEnd"/>
-      <w:r>
-        <w:rPr>
-          <w:i/>
-          <w:iCs/>
-          <w:lang w:val="es-CL"/>
-        </w:rPr>
-        <w:t xml:space="preserve"> as e)</w:t>
-      </w:r>
-      <w:r>
-        <w:rPr>
-          <w:lang w:val="es-CL"/>
-        </w:rPr>
-        <w:t xml:space="preserve"> para emitir una alerta crítica en la consola, evitando que el </w:t>
-      </w:r>
       <w:proofErr w:type="spellStart"/>
-      <w:r>
-        <w:rPr>
-          <w:lang w:val="es-CL"/>
-        </w:rPr>
-        <w:t>Kernel</w:t>
-      </w:r>
       <w:proofErr w:type="spellEnd"/>
-      <w:r>
-        <w:rPr>
-          <w:lang w:val="es-CL"/>
-        </w:rPr>
-        <w:t xml:space="preserve"> de </w:t>
-      </w:r>
       <w:proofErr w:type="spellStart"/>
-      <w:r>
-        <w:rPr>
-          <w:lang w:val="es-CL"/>
-        </w:rPr>
-        <w:t>Jupyter</w:t>
-      </w:r>
       <w:proofErr w:type="spellEnd"/>
       <w:r>
-        <w:rPr>
-          <w:lang w:val="es-CL"/>
-        </w:rPr>
-        <w:t xml:space="preserve"> experimente una interrupción abrupta. </w:t>
+        <w:t>ejecutar_ingesta(ruta_datos, separador=";"): Esta función carga el archivo diabetes_raw.csv desde una ruta relativa del repositorio y valida previamente que el archivo exista. Su propósito es asegurar una ingesta controlada del dataset crudo, evitando errores de ruta y manteniendo el archivo original sin modificaciones.</w:t>
       </w:r>
     </w:p>
     <w:p>
@@ -13821,78 +12465,13 @@
         </w:rPr>
       </w:pPr>
       <w:proofErr w:type="spellStart"/>
-      <w:r>
-        <w:rPr>
-          <w:b/>
-          <w:bCs/>
-          <w:lang w:val="es-CL"/>
-        </w:rPr>
-        <w:t>Auditar_esquema_volumetrico</w:t>
-      </w:r>
       <w:proofErr w:type="spellEnd"/>
-      <w:r>
-        <w:rPr>
-          <w:b/>
-          <w:bCs/>
-          <w:lang w:val="es-CL"/>
-        </w:rPr>
-        <w:t>(</w:t>
-      </w:r>
       <w:proofErr w:type="spellStart"/>
-      <w:r>
-        <w:rPr>
-          <w:b/>
-          <w:bCs/>
-          <w:lang w:val="es-CL"/>
-        </w:rPr>
-        <w:t>df</w:t>
-      </w:r>
       <w:proofErr w:type="spellEnd"/>
-      <w:r>
-        <w:rPr>
-          <w:b/>
-          <w:bCs/>
-          <w:lang w:val="es-CL"/>
-        </w:rPr>
-        <w:t>):</w:t>
-      </w:r>
-      <w:r>
-        <w:rPr>
-          <w:lang w:val="es-CL"/>
-        </w:rPr>
-        <w:t xml:space="preserve"> Este componente inspecciona la topología y dimensiones de la matriz de datos cargada globalmente. Utiliza propiedades estructurales para verificar que el archivo cumpla con el volumen esperado de registros y ejecuta un barrido lineal que recorre los metadatos de las columnas para mapear nominalmente cada variable clínica junto con su tipo de dato nativo </w:t>
-      </w:r>
-      <w:r>
-        <w:rPr>
-          <w:i/>
-          <w:iCs/>
-          <w:lang w:val="es-CL"/>
-        </w:rPr>
-        <w:t>(</w:t>
-      </w:r>
       <w:proofErr w:type="spellStart"/>
-      <w:r>
-        <w:rPr>
-          <w:i/>
-          <w:iCs/>
-          <w:lang w:val="es-CL"/>
-        </w:rPr>
-        <w:t>dtype</w:t>
-      </w:r>
       <w:proofErr w:type="spellEnd"/>
       <w:r>
-        <w:rPr>
-          <w:i/>
-          <w:iCs/>
-          <w:lang w:val="es-CL"/>
-        </w:rPr>
-        <w:t>)</w:t>
-      </w:r>
-      <w:r>
-        <w:rPr>
-          <w:lang w:val="es-CL"/>
-        </w:rPr>
-        <w:t xml:space="preserve"> asignado por el motor de ejecución. Su objetivo técnico es aislar de inmediato cualquier conflicto de esquemas. </w:t>
+        <w:t>Bloque de inspección estructural: Este bloque lista las columnas disponibles, reporta los tipos de datos, ejecuta df.info() y muestra las primeras observaciones del dataset. Su objetivo es documentar la estructura inicial de la matriz de datos y verificar que la carga sea consistente con el archivo diabetes_raw.csv.</w:t>
       </w:r>
     </w:p>
     <w:p>
@@ -13907,46 +12486,11 @@
         </w:rPr>
       </w:pPr>
       <w:proofErr w:type="spellStart"/>
-      <w:r>
-        <w:rPr>
-          <w:b/>
-          <w:bCs/>
-          <w:lang w:val="es-CL"/>
-        </w:rPr>
-        <w:t>Cuantificar_degradacion_datos</w:t>
-      </w:r>
       <w:proofErr w:type="spellEnd"/>
-      <w:r>
-        <w:rPr>
-          <w:b/>
-          <w:bCs/>
-          <w:lang w:val="es-CL"/>
-        </w:rPr>
-        <w:t>(</w:t>
-      </w:r>
       <w:proofErr w:type="spellStart"/>
-      <w:r>
-        <w:rPr>
-          <w:b/>
-          <w:bCs/>
-          <w:lang w:val="es-CL"/>
-        </w:rPr>
-        <w:t>df</w:t>
-      </w:r>
       <w:proofErr w:type="spellEnd"/>
       <w:r>
-        <w:rPr>
-          <w:b/>
-          <w:bCs/>
-          <w:lang w:val="es-CL"/>
-        </w:rPr>
-        <w:t>):</w:t>
-      </w:r>
-      <w:r>
-        <w:rPr>
-          <w:lang w:val="es-CL"/>
-        </w:rPr>
-        <w:t xml:space="preserve"> Función encargada del perfilado estadístico de anomalías de calidad. Este bloque calcula el vector de nulidades absolutas y relativas por columna, transformando el conteo de vacíos en tasas porcentuales de pérdida informacional respecto al tamaño total de la muestra. Adicionalmente, evalúa la redundancia computacional calculando la suma de registros duplicados exactos en la matriz para diagnosticar el ruido estadístico de origen. </w:t>
+        <w:t>auditar_calidad_basica(datos): Esta función reporta indicadores básicos de calidad sin modificar el dataset original. Calcula valores nulos por variable, identifica registros duplicados exactos y presenta la distribución absoluta y porcentual de la variable objetivo Outcome.</w:t>
       </w:r>
     </w:p>
     <w:p>
@@ -13961,62 +12505,13 @@
         </w:rPr>
       </w:pPr>
       <w:proofErr w:type="spellStart"/>
-      <w:r>
-        <w:rPr>
-          <w:b/>
-          <w:bCs/>
-          <w:lang w:val="es-CL"/>
-        </w:rPr>
-        <w:t>Analizar_balance_target</w:t>
-      </w:r>
       <w:proofErr w:type="spellEnd"/>
-      <w:r>
-        <w:rPr>
-          <w:b/>
-          <w:bCs/>
-          <w:lang w:val="es-CL"/>
-        </w:rPr>
-        <w:t>(</w:t>
-      </w:r>
       <w:proofErr w:type="spellStart"/>
-      <w:r>
-        <w:rPr>
-          <w:b/>
-          <w:bCs/>
-          <w:lang w:val="es-CL"/>
-        </w:rPr>
-        <w:t>df</w:t>
-      </w:r>
       <w:proofErr w:type="spellEnd"/>
-      <w:r>
-        <w:rPr>
-          <w:b/>
-          <w:bCs/>
-          <w:lang w:val="es-CL"/>
-        </w:rPr>
-        <w:t>):</w:t>
-      </w:r>
-      <w:r>
-        <w:rPr>
-          <w:lang w:val="es-CL"/>
-        </w:rPr>
-        <w:t xml:space="preserve"> Diseñada específicamente para auditar la variable dependiente </w:t>
-      </w:r>
       <w:proofErr w:type="spellStart"/>
-      <w:r>
-        <w:rPr>
-          <w:i/>
-          <w:iCs/>
-          <w:lang w:val="es-CL"/>
-        </w:rPr>
-        <w:t>Outcome</w:t>
-      </w:r>
       <w:proofErr w:type="spellEnd"/>
       <w:r>
-        <w:rPr>
-          <w:lang w:val="es-CL"/>
-        </w:rPr>
-        <w:t xml:space="preserve">, esta función computa las proporciones y frecuencias absolutas de las clases de diagnóstico. Su inclusión es crítica para alertar tempranamente sobre desbalances en la muestra, asegurando que el equipo de ingeniería conozca las asimetrías empíricas antes de estructurar los algoritmos predictivos en las etapas posteriores del proyecto. </w:t>
+        <w:t>Bloque de cierre técnico: El notebook finaliza documentando que los resultados obtenidos constituyen una línea base reproducible para Fase 1. Esta línea base permite fundamentar las decisiones de limpieza, imputación, transformación y modelamiento que serán abordadas en fases posteriores.</w:t>
       </w:r>
     </w:p>
     <w:p>
@@ -14028,24 +12523,7 @@
         </w:rPr>
       </w:pPr>
       <w:r>
-        <w:rPr>
-          <w:lang w:val="es-CL"/>
-        </w:rPr>
-        <w:t xml:space="preserve">La cohesión de este flujo secuencial garantiza un comportamiento predecible del software. Al invocar consecutivamente estas funciones de arriba a abajo </w:t>
-      </w:r>
-      <w:r>
-        <w:rPr>
-          <w:i/>
-          <w:iCs/>
-          <w:lang w:val="es-CL"/>
-        </w:rPr>
-        <w:t>(Top-Down)</w:t>
-      </w:r>
-      <w:r>
-        <w:rPr>
-          <w:lang w:val="es-CL"/>
-        </w:rPr>
-        <w:t>, el pipeline transita por estados de validación continua donde cada bloque depende del éxito operativo del anterior, sentando una línea base de software que cumple con los estándares institucionales de desarrollo seguro y gobernanza de datos clínicos.</w:t>
+        <w:t>La cohesión de este flujo secuencial garantiza un comportamiento predecible del software. Al ejecutar el notebook de arriba hacia abajo mediante Restart &amp; Run All, el flujo transita desde la verificación del entorno hacia la ingesta, inspección y auditoría inicial del dataset, manteniendo la trazabilidad técnica sin alterar los datos crudos.</w:t>
       </w:r>
     </w:p>
     <w:p>
@@ -14259,31 +12737,10 @@
           <w:lang w:val="es-CL"/>
         </w:rPr>
       </w:pPr>
-      <w:r>
-        <w:rPr>
-          <w:rFonts w:cs="Calibri"/>
-          <w:color w:val="auto"/>
-          <w:lang w:val="es-CL"/>
-        </w:rPr>
-        <w:t xml:space="preserve">El procesamiento se ejecuta en la memoria RAM del </w:t>
-      </w:r>
       <w:proofErr w:type="spellStart"/>
-      <w:r>
-        <w:rPr>
-          <w:rFonts w:cs="Calibri"/>
-          <w:color w:val="auto"/>
-          <w:lang w:val="es-CL"/>
-        </w:rPr>
-        <w:t>Kernel</w:t>
-      </w:r>
       <w:proofErr w:type="spellEnd"/>
       <w:r>
-        <w:rPr>
-          <w:rFonts w:cs="Calibri"/>
-          <w:color w:val="auto"/>
-          <w:lang w:val="es-CL"/>
-        </w:rPr>
-        <w:t xml:space="preserve"> científico administrado por Anaconda y Python 3.12, organizando la totalidad de las reglas de negocio dentro de funciones de ámbito global y celdas lógicas interdependientes ejecutadas secuencialmente en el cuaderno de trabajo. El flujo lógico de control y cómputo se desglosa en cinco fases operacionales encadenadas:</w:t>
+        <w:t>El procesamiento se ejecuta en la memoria RAM del kernel científico asociado a Python 3.12.4, organizando las reglas de auditoría inicial en funciones globales simples y celdas lógicas interdependientes. El flujo lógico de control y cómputo se desglosa en cuatro bloques operacionales encadenados:</w:t>
       </w:r>
     </w:p>
     <w:p>
@@ -14315,59 +12772,12 @@
           <w:lang w:val="es-CL"/>
         </w:rPr>
       </w:pPr>
-      <w:r>
-        <w:rPr>
-          <w:rFonts w:cs="Calibri"/>
-          <w:b/>
-          <w:bCs/>
-          <w:color w:val="auto"/>
-          <w:lang w:val="es-CL"/>
-        </w:rPr>
-        <w:t>Auditoría del Entorno:</w:t>
-      </w:r>
-      <w:r>
-        <w:rPr>
-          <w:rFonts w:cs="Calibri"/>
-          <w:color w:val="auto"/>
-          <w:lang w:val="es-CL"/>
-        </w:rPr>
-        <w:t xml:space="preserve"> La función global </w:t>
-      </w:r>
       <w:proofErr w:type="spellStart"/>
-      <w:r>
-        <w:rPr>
-          <w:rFonts w:cs="Calibri"/>
-          <w:color w:val="auto"/>
-          <w:lang w:val="es-CL"/>
-        </w:rPr>
-        <w:t>verificar_entorno_</w:t>
-      </w:r>
       <w:proofErr w:type="gramStart"/>
-      <w:r>
-        <w:rPr>
-          <w:rFonts w:cs="Calibri"/>
-          <w:color w:val="auto"/>
-          <w:lang w:val="es-CL"/>
-        </w:rPr>
-        <w:t>reproducible</w:t>
-      </w:r>
       <w:proofErr w:type="spellEnd"/>
-      <w:r>
-        <w:rPr>
-          <w:rFonts w:cs="Calibri"/>
-          <w:color w:val="auto"/>
-          <w:lang w:val="es-CL"/>
-        </w:rPr>
-        <w:t>(</w:t>
-      </w:r>
       <w:proofErr w:type="gramEnd"/>
       <w:r>
-        <w:rPr>
-          <w:rFonts w:cs="Calibri"/>
-          <w:color w:val="auto"/>
-          <w:lang w:val="es-CL"/>
-        </w:rPr>
-        <w:t>) interroga al sistema operativo e intérprete activo para validar las firmas de las librerías científicas antes de manipular la información.</w:t>
+        <w:t>Auditoría del entorno: Se importan las librerías necesarias y se consulta la versión real de Python y de las dependencias declaradas para Fase 1 mediante la función obtener_version(paquete).</w:t>
       </w:r>
     </w:p>
     <w:p>
@@ -14399,89 +12809,14 @@
           <w:lang w:val="es-CL"/>
         </w:rPr>
       </w:pPr>
-      <w:r>
-        <w:rPr>
-          <w:rFonts w:cs="Calibri"/>
-          <w:b/>
-          <w:bCs/>
-          <w:color w:val="auto"/>
-          <w:lang w:val="es-CL"/>
-        </w:rPr>
-        <w:t>Ingesta Con Control de Excepciones:</w:t>
-      </w:r>
-      <w:r>
-        <w:rPr>
-          <w:rFonts w:cs="Calibri"/>
-          <w:color w:val="auto"/>
-          <w:lang w:val="es-CL"/>
-        </w:rPr>
-        <w:t xml:space="preserve"> Se invoca la función global </w:t>
-      </w:r>
       <w:proofErr w:type="spellStart"/>
-      <w:r>
-        <w:rPr>
-          <w:rFonts w:cs="Calibri"/>
-          <w:color w:val="auto"/>
-          <w:lang w:val="es-CL"/>
-        </w:rPr>
-        <w:t>ejecutar_ingesta</w:t>
-      </w:r>
       <w:proofErr w:type="spellEnd"/>
-      <w:r>
-        <w:rPr>
-          <w:rFonts w:cs="Calibri"/>
-          <w:color w:val="auto"/>
-          <w:lang w:val="es-CL"/>
-        </w:rPr>
-        <w:t>(</w:t>
-      </w:r>
       <w:proofErr w:type="spellStart"/>
-      <w:r>
-        <w:rPr>
-          <w:rFonts w:cs="Calibri"/>
-          <w:color w:val="auto"/>
-          <w:lang w:val="es-CL"/>
-        </w:rPr>
-        <w:t>ruta_datos</w:t>
-      </w:r>
       <w:proofErr w:type="spellEnd"/>
-      <w:r>
-        <w:rPr>
-          <w:rFonts w:cs="Calibri"/>
-          <w:color w:val="auto"/>
-          <w:lang w:val="es-CL"/>
-        </w:rPr>
-        <w:t xml:space="preserve">), la cual abre un canal de lectura controlado perimetralmente mediante bloques </w:t>
-      </w:r>
-      <w:r>
-        <w:rPr>
-          <w:rFonts w:cs="Calibri"/>
-          <w:i/>
-          <w:iCs/>
-          <w:color w:val="auto"/>
-          <w:lang w:val="es-CL"/>
-        </w:rPr>
-        <w:t>try-</w:t>
-      </w:r>
       <w:proofErr w:type="spellStart"/>
-      <w:r>
-        <w:rPr>
-          <w:rFonts w:cs="Calibri"/>
-          <w:i/>
-          <w:iCs/>
-          <w:color w:val="auto"/>
-          <w:lang w:val="es-CL"/>
-        </w:rPr>
-        <w:t>except</w:t>
-      </w:r>
       <w:proofErr w:type="spellEnd"/>
       <w:r>
-        <w:rPr>
-          <w:rFonts w:cs="Calibri"/>
-          <w:color w:val="auto"/>
-          <w:lang w:val="es-CL"/>
-        </w:rPr>
-        <w:t>, abstrayendo fallos críticos de hardware o direccionamiento.</w:t>
+        <w:t>Ingesta con control de ruta: Se invoca la función ejecutar_ingesta(ruta_datos, separador=";"), la cual valida la existencia del archivo diabetes_raw.csv y lo carga mediante Pandas desde data/raw/.</w:t>
       </w:r>
     </w:p>
     <w:p>
@@ -14512,105 +12847,18 @@
           <w:lang w:val="es-CL"/>
         </w:rPr>
       </w:pPr>
-      <w:r>
-        <w:rPr>
-          <w:rFonts w:cs="Calibri"/>
-          <w:b/>
-          <w:bCs/>
-          <w:color w:val="auto"/>
-          <w:lang w:val="es-CL"/>
-        </w:rPr>
-        <w:t>Inspección Topológica del Esquema:</w:t>
-      </w:r>
-      <w:r>
-        <w:rPr>
-          <w:rFonts w:cs="Calibri"/>
-          <w:color w:val="auto"/>
-          <w:lang w:val="es-CL"/>
-        </w:rPr>
-        <w:t xml:space="preserve"> La función global </w:t>
-      </w:r>
       <w:proofErr w:type="spellStart"/>
-      <w:r>
-        <w:rPr>
-          <w:rFonts w:cs="Calibri"/>
-          <w:color w:val="auto"/>
-          <w:lang w:val="es-CL"/>
-        </w:rPr>
-        <w:t>auditar_esquema_volumetrico</w:t>
-      </w:r>
       <w:proofErr w:type="spellEnd"/>
-      <w:r>
-        <w:rPr>
-          <w:rFonts w:cs="Calibri"/>
-          <w:color w:val="auto"/>
-          <w:lang w:val="es-CL"/>
-        </w:rPr>
-        <w:t>(</w:t>
-      </w:r>
       <w:proofErr w:type="spellStart"/>
-      <w:r>
-        <w:rPr>
-          <w:rFonts w:cs="Calibri"/>
-          <w:color w:val="auto"/>
-          <w:lang w:val="es-CL"/>
-        </w:rPr>
-        <w:t>df</w:t>
-      </w:r>
       <w:proofErr w:type="spellEnd"/>
-      <w:r>
-        <w:rPr>
-          <w:rFonts w:cs="Calibri"/>
-          <w:color w:val="auto"/>
-          <w:lang w:val="es-CL"/>
-        </w:rPr>
-        <w:t xml:space="preserve">) interroga la propiedad </w:t>
-      </w:r>
       <w:proofErr w:type="gramStart"/>
-      <w:r>
-        <w:rPr>
-          <w:rFonts w:cs="Calibri"/>
-          <w:color w:val="auto"/>
-          <w:lang w:val="es-CL"/>
-        </w:rPr>
-        <w:t>estática .</w:t>
-      </w:r>
       <w:proofErr w:type="spellStart"/>
-      <w:r>
-        <w:rPr>
-          <w:rFonts w:cs="Calibri"/>
-          <w:color w:val="auto"/>
-          <w:lang w:val="es-CL"/>
-        </w:rPr>
-        <w:t>shape</w:t>
-      </w:r>
       <w:proofErr w:type="spellEnd"/>
       <w:proofErr w:type="gramEnd"/>
-      <w:r>
-        <w:rPr>
-          <w:rFonts w:cs="Calibri"/>
-          <w:color w:val="auto"/>
-          <w:lang w:val="es-CL"/>
-        </w:rPr>
-        <w:t xml:space="preserve"> del </w:t>
-      </w:r>
       <w:proofErr w:type="spellStart"/>
-      <w:r>
-        <w:rPr>
-          <w:rFonts w:cs="Calibri"/>
-          <w:color w:val="auto"/>
-          <w:lang w:val="es-CL"/>
-        </w:rPr>
-        <w:t>DataFrame</w:t>
-      </w:r>
       <w:proofErr w:type="spellEnd"/>
       <w:r>
-        <w:rPr>
-          <w:rFonts w:cs="Calibri"/>
-          <w:color w:val="auto"/>
-          <w:lang w:val="es-CL"/>
-        </w:rPr>
-        <w:t xml:space="preserve"> de Pandas y desglosa los metadatos de las columnas para aislar colapsos tipológicos tempranos.</w:t>
+        <w:t>Inspección estructural del esquema: El notebook lista columnas, muestra tipos de datos, ejecuta df.info() y presenta las primeras filas del DataFrame para verificar dimensiones, estructura y lectura correcta del archivo.</w:t>
       </w:r>
     </w:p>
     <w:p>
@@ -14631,59 +12879,12 @@
           <w:lang w:val="es-CL"/>
         </w:rPr>
       </w:pPr>
-      <w:r>
-        <w:rPr>
-          <w:rFonts w:cs="Calibri"/>
-          <w:b/>
-          <w:bCs/>
-          <w:color w:val="auto"/>
-          <w:lang w:val="es-CL"/>
-        </w:rPr>
-        <w:t>Perfilado de Degradación Estocástica:</w:t>
-      </w:r>
-      <w:r>
-        <w:rPr>
-          <w:rFonts w:cs="Calibri"/>
-          <w:color w:val="auto"/>
-          <w:lang w:val="es-CL"/>
-        </w:rPr>
-        <w:t xml:space="preserve"> A través de la función global </w:t>
-      </w:r>
       <w:proofErr w:type="spellStart"/>
-      <w:r>
-        <w:rPr>
-          <w:rFonts w:cs="Calibri"/>
-          <w:color w:val="auto"/>
-          <w:lang w:val="es-CL"/>
-        </w:rPr>
-        <w:t>cuantificar_degradacion_datos</w:t>
-      </w:r>
       <w:proofErr w:type="spellEnd"/>
-      <w:r>
-        <w:rPr>
-          <w:rFonts w:cs="Calibri"/>
-          <w:color w:val="auto"/>
-          <w:lang w:val="es-CL"/>
-        </w:rPr>
-        <w:t>(</w:t>
-      </w:r>
       <w:proofErr w:type="spellStart"/>
-      <w:r>
-        <w:rPr>
-          <w:rFonts w:cs="Calibri"/>
-          <w:color w:val="auto"/>
-          <w:lang w:val="es-CL"/>
-        </w:rPr>
-        <w:t>df</w:t>
-      </w:r>
       <w:proofErr w:type="spellEnd"/>
       <w:r>
-        <w:rPr>
-          <w:rFonts w:cs="Calibri"/>
-          <w:color w:val="auto"/>
-          <w:lang w:val="es-CL"/>
-        </w:rPr>
-        <w:t>), el sistema ejecuta un escaneo vectorial para indexar las tasas de nulidad absoluta/relativa y la redundancia por registros duplicados.</w:t>
+        <w:t>Auditoría básica de calidad: A través de la función auditar_calidad_basica(datos), el sistema reporta valores nulos por variable, duplicados exactos y distribución absoluta y porcentual de Outcome.</w:t>
       </w:r>
     </w:p>
     <w:p>
@@ -14715,60 +12916,12 @@
           <w:lang w:val="es-CL"/>
         </w:rPr>
       </w:pPr>
-      <w:r>
-        <w:rPr>
-          <w:rFonts w:cs="Calibri"/>
-          <w:b/>
-          <w:bCs/>
-          <w:color w:val="auto"/>
-          <w:lang w:val="es-CL"/>
-        </w:rPr>
-        <w:lastRenderedPageBreak/>
-        <w:t>Cálculo de Densidad del Target:</w:t>
-      </w:r>
-      <w:r>
-        <w:rPr>
-          <w:rFonts w:cs="Calibri"/>
-          <w:color w:val="auto"/>
-          <w:lang w:val="es-CL"/>
-        </w:rPr>
-        <w:t xml:space="preserve"> Finalmente, la función global </w:t>
-      </w:r>
       <w:proofErr w:type="spellStart"/>
-      <w:r>
-        <w:rPr>
-          <w:rFonts w:cs="Calibri"/>
-          <w:color w:val="auto"/>
-          <w:lang w:val="es-CL"/>
-        </w:rPr>
-        <w:t>analizar_balance_target</w:t>
-      </w:r>
       <w:proofErr w:type="spellEnd"/>
-      <w:r>
-        <w:rPr>
-          <w:rFonts w:cs="Calibri"/>
-          <w:color w:val="auto"/>
-          <w:lang w:val="es-CL"/>
-        </w:rPr>
-        <w:t>(</w:t>
-      </w:r>
       <w:proofErr w:type="spellStart"/>
-      <w:r>
-        <w:rPr>
-          <w:rFonts w:cs="Calibri"/>
-          <w:color w:val="auto"/>
-          <w:lang w:val="es-CL"/>
-        </w:rPr>
-        <w:t>df</w:t>
-      </w:r>
       <w:proofErr w:type="spellEnd"/>
       <w:r>
-        <w:rPr>
-          <w:rFonts w:cs="Calibri"/>
-          <w:color w:val="auto"/>
-          <w:lang w:val="es-CL"/>
-        </w:rPr>
-        <w:t>) aísla la serie de datos correspondiente a la variable objetivo para evaluar las asimetrías de clase en la muestra clínica.</w:t>
+        <w:t>Cierre técnico: Finalmente, el notebook declara que los resultados corresponden a una línea base de diagnóstico inicial, sin limpieza, imputación, transformación ni modelamiento predictivo.</w:t>
       </w:r>
     </w:p>
     <w:p>
@@ -14918,125 +13071,20 @@
           <w:lang w:val="es-CL"/>
         </w:rPr>
       </w:pPr>
-      <w:r>
-        <w:rPr>
-          <w:rFonts w:cs="Calibri"/>
-          <w:color w:val="auto"/>
-          <w:lang w:val="es-CL"/>
-        </w:rPr>
-        <w:t>La gestión de proyectos científicos basados en cuadernos de trabajo (</w:t>
-      </w:r>
       <w:proofErr w:type="spellStart"/>
-      <w:r>
-        <w:rPr>
-          <w:rFonts w:cs="Calibri"/>
-          <w:i/>
-          <w:iCs/>
-          <w:color w:val="auto"/>
-          <w:lang w:val="es-CL"/>
-        </w:rPr>
-        <w:t>Jupyter</w:t>
-      </w:r>
       <w:proofErr w:type="spellEnd"/>
-      <w:r>
-        <w:rPr>
-          <w:rFonts w:cs="Calibri"/>
-          <w:i/>
-          <w:iCs/>
-          <w:color w:val="auto"/>
-          <w:lang w:val="es-CL"/>
-        </w:rPr>
-        <w:t xml:space="preserve"> Notebooks</w:t>
-      </w:r>
-      <w:r>
-        <w:rPr>
-          <w:rFonts w:cs="Calibri"/>
-          <w:color w:val="auto"/>
-          <w:lang w:val="es-CL"/>
-        </w:rPr>
-        <w:t xml:space="preserve">) impone desafíos particulares en el ámbito de la ingeniería de software corporativa. Debido a que los </w:t>
-      </w:r>
       <w:proofErr w:type="gramStart"/>
-      <w:r>
-        <w:rPr>
-          <w:rFonts w:cs="Calibri"/>
-          <w:color w:val="auto"/>
-          <w:lang w:val="es-CL"/>
-        </w:rPr>
-        <w:t>archivos .</w:t>
-      </w:r>
       <w:proofErr w:type="spellStart"/>
-      <w:r>
-        <w:rPr>
-          <w:rFonts w:cs="Calibri"/>
-          <w:color w:val="auto"/>
-          <w:lang w:val="es-CL"/>
-        </w:rPr>
-        <w:t>ipynb</w:t>
-      </w:r>
       <w:proofErr w:type="spellEnd"/>
       <w:proofErr w:type="gramEnd"/>
-      <w:r>
-        <w:rPr>
-          <w:rFonts w:cs="Calibri"/>
-          <w:color w:val="auto"/>
-          <w:lang w:val="es-CL"/>
-        </w:rPr>
-        <w:t xml:space="preserve"> están estructurados internamente como documentos JSON que mezclan código fuente, documentación en </w:t>
-      </w:r>
       <w:proofErr w:type="spellStart"/>
-      <w:r>
-        <w:rPr>
-          <w:rFonts w:cs="Calibri"/>
-          <w:color w:val="auto"/>
-          <w:lang w:val="es-CL"/>
-        </w:rPr>
-        <w:t>Markdown</w:t>
-      </w:r>
       <w:proofErr w:type="spellEnd"/>
-      <w:r>
-        <w:rPr>
-          <w:rFonts w:cs="Calibri"/>
-          <w:color w:val="auto"/>
-          <w:lang w:val="es-CL"/>
-        </w:rPr>
-        <w:t xml:space="preserve">, metadatos de ejecución y flujos de salida binarios (como las imágenes renderizadas por </w:t>
-      </w:r>
       <w:proofErr w:type="spellStart"/>
-      <w:r>
-        <w:rPr>
-          <w:rFonts w:cs="Calibri"/>
-          <w:color w:val="auto"/>
-          <w:lang w:val="es-CL"/>
-        </w:rPr>
-        <w:t>Matplotlib</w:t>
-      </w:r>
       <w:proofErr w:type="spellEnd"/>
-      <w:r>
-        <w:rPr>
-          <w:rFonts w:cs="Calibri"/>
-          <w:color w:val="auto"/>
-          <w:lang w:val="es-CL"/>
-        </w:rPr>
-        <w:t xml:space="preserve"> y </w:t>
-      </w:r>
       <w:proofErr w:type="spellStart"/>
-      <w:r>
-        <w:rPr>
-          <w:rFonts w:cs="Calibri"/>
-          <w:color w:val="auto"/>
-          <w:lang w:val="es-CL"/>
-        </w:rPr>
-        <w:t>Seaborn</w:t>
-      </w:r>
       <w:proofErr w:type="spellEnd"/>
       <w:r>
-        <w:rPr>
-          <w:rFonts w:cs="Calibri"/>
-          <w:color w:val="auto"/>
-          <w:lang w:val="es-CL"/>
-        </w:rPr>
-        <w:t>), el control de versiones tradicional puede volverse ineficiente si no se establece un protocolo estricto de integración.</w:t>
+        <w:t>La gestión de proyectos científicos basados en cuadernos de trabajo (Jupyter Notebooks) impone desafíos particulares en el ámbito de la ingeniería de software. Debido a que los archivos .ipynb están estructurados internamente como documentos JSON que mezclan código fuente, documentación en Markdown, metadatos de ejecución y salidas textuales del diagnóstico, el control de versiones puede volverse menos claro si no se establece un protocolo de integración ordenado.</w:t>
       </w:r>
     </w:p>
     <w:p>
@@ -15137,117 +13185,16 @@
           <w:lang w:val="es-CL"/>
         </w:rPr>
       </w:pPr>
-      <w:r>
-        <w:rPr>
-          <w:rFonts w:cs="Calibri"/>
-          <w:b/>
-          <w:bCs/>
-          <w:color w:val="auto"/>
-          <w:lang w:val="es-CL"/>
-        </w:rPr>
-        <w:t>Saneamiento de Metadatos y Salidas Binarias:</w:t>
-      </w:r>
-      <w:r>
-        <w:rPr>
-          <w:rFonts w:cs="Calibri"/>
-          <w:color w:val="auto"/>
-          <w:lang w:val="es-CL"/>
-        </w:rPr>
-        <w:t xml:space="preserve"> Para evitar la saturación del repositorio con líneas de cambios (</w:t>
-      </w:r>
       <w:proofErr w:type="spellStart"/>
-      <w:r>
-        <w:rPr>
-          <w:rFonts w:cs="Calibri"/>
-          <w:i/>
-          <w:iCs/>
-          <w:color w:val="auto"/>
-          <w:lang w:val="es-CL"/>
-        </w:rPr>
-        <w:t>diffs</w:t>
-      </w:r>
       <w:proofErr w:type="spellEnd"/>
-      <w:r>
-        <w:rPr>
-          <w:rFonts w:cs="Calibri"/>
-          <w:color w:val="auto"/>
-          <w:lang w:val="es-CL"/>
-        </w:rPr>
-        <w:t>) ilegibles causadas por alteraciones en los contadores de ejecución (</w:t>
-      </w:r>
       <w:proofErr w:type="spellStart"/>
-      <w:r>
-        <w:rPr>
-          <w:rFonts w:cs="Calibri"/>
-          <w:color w:val="auto"/>
-          <w:lang w:val="es-CL"/>
-        </w:rPr>
-        <w:t>execution_count</w:t>
-      </w:r>
       <w:proofErr w:type="spellEnd"/>
-      <w:r>
-        <w:rPr>
-          <w:rFonts w:cs="Calibri"/>
-          <w:color w:val="auto"/>
-          <w:lang w:val="es-CL"/>
-        </w:rPr>
-        <w:t>) o gráficos incrustados pesados, el protocolo exige que, antes de realizar cualquier confirmación (</w:t>
-      </w:r>
       <w:proofErr w:type="spellStart"/>
-      <w:r>
-        <w:rPr>
-          <w:rFonts w:cs="Calibri"/>
-          <w:i/>
-          <w:iCs/>
-          <w:color w:val="auto"/>
-          <w:lang w:val="es-CL"/>
-        </w:rPr>
-        <w:t>commit</w:t>
-      </w:r>
       <w:proofErr w:type="spellEnd"/>
-      <w:r>
-        <w:rPr>
-          <w:rFonts w:cs="Calibri"/>
-          <w:color w:val="auto"/>
-          <w:lang w:val="es-CL"/>
-        </w:rPr>
-        <w:t>), el cuaderno mantenga sus salidas congeladas exclusivamente en hitos de entrega (</w:t>
-      </w:r>
       <w:proofErr w:type="spellStart"/>
-      <w:r>
-        <w:rPr>
-          <w:rFonts w:cs="Calibri"/>
-          <w:i/>
-          <w:iCs/>
-          <w:color w:val="auto"/>
-          <w:lang w:val="es-CL"/>
-        </w:rPr>
-        <w:t>baselines</w:t>
-      </w:r>
       <w:proofErr w:type="spellEnd"/>
       <w:r>
-        <w:rPr>
-          <w:rFonts w:cs="Calibri"/>
-          <w:color w:val="auto"/>
-          <w:lang w:val="es-CL"/>
-        </w:rPr>
-        <w:t xml:space="preserve">). Esto asegura que el histórico de Git registre únicamente las mutaciones reales en la lógica algorítmica y </w:t>
-      </w:r>
-      <w:r>
-        <w:rPr>
-          <w:rFonts w:cs="Calibri"/>
-          <w:color w:val="auto"/>
-          <w:lang w:val="es-CL"/>
-        </w:rPr>
-        <w:t>las funciones del script secuencial</w:t>
-      </w:r>
-      <w:r>
-        <w:rPr>
-          <w:rFonts w:cs="Calibri"/>
-          <w:color w:val="auto"/>
-          <w:lang w:val="es-CL"/>
-        </w:rPr>
-        <w:t>.</w:t>
+        <w:t>Saneamiento de Metadatos y Salidas de Ejecución: Para evitar la saturación del repositorio con líneas de cambios ilegibles causadas por alteraciones en los contadores de ejecución (execution_count) o salidas extensas, el protocolo exige que, antes de cada confirmación relevante, el cuaderno sea revisado y ejecutado de forma ordenada. Esto asegura que el histórico de Git registre cambios reales en la lógica y en la documentación del flujo secuencial.</w:t>
       </w:r>
     </w:p>
     <w:p>
@@ -16085,49 +14032,12 @@
           <w:lang w:val="es-CL"/>
         </w:rPr>
       </w:pPr>
-      <w:r>
-        <w:rPr>
-          <w:rFonts w:cs="Calibri"/>
-          <w:color w:val="auto"/>
-          <w:lang w:val="es-CL"/>
-        </w:rPr>
-        <w:t xml:space="preserve">La firma dinámica de metadatos generada por el método </w:t>
-      </w:r>
       <w:proofErr w:type="spellStart"/>
-      <w:r>
-        <w:rPr>
-          <w:rFonts w:cs="Calibri"/>
-          <w:color w:val="auto"/>
-          <w:lang w:val="es-CL"/>
-        </w:rPr>
-        <w:t>verificar_entorno_</w:t>
-      </w:r>
       <w:proofErr w:type="gramStart"/>
-      <w:r>
-        <w:rPr>
-          <w:rFonts w:cs="Calibri"/>
-          <w:color w:val="auto"/>
-          <w:lang w:val="es-CL"/>
-        </w:rPr>
-        <w:t>reproducible</w:t>
-      </w:r>
       <w:proofErr w:type="spellEnd"/>
-      <w:r>
-        <w:rPr>
-          <w:rFonts w:cs="Calibri"/>
-          <w:color w:val="auto"/>
-          <w:lang w:val="es-CL"/>
-        </w:rPr>
-        <w:t>(</w:t>
-      </w:r>
       <w:proofErr w:type="gramEnd"/>
       <w:r>
-        <w:rPr>
-          <w:rFonts w:cs="Calibri"/>
-          <w:color w:val="auto"/>
-          <w:lang w:val="es-CL"/>
-        </w:rPr>
-        <w:t>) coincida al 100% con las restricciones contractuales del requirements.txt guardado en la raíz.</w:t>
+        <w:t>La firma dinámica de metadatos generada durante la verificación de versiones del notebook coincide con las restricciones declaradas en el archivo requirements.txt de Fase 1.</w:t>
       </w:r>
     </w:p>
     <w:p>
@@ -16289,55 +14199,12 @@
           <w:lang w:val="es-CL"/>
         </w:rPr>
       </w:pPr>
-      <w:r>
-        <w:rPr>
-          <w:rFonts w:cs="Calibri"/>
-          <w:color w:val="auto"/>
-          <w:lang w:val="es-CL"/>
-        </w:rPr>
-        <w:t xml:space="preserve">Para mitigar el riesgo de colisiones de software y el denominado </w:t>
-      </w:r>
       <w:proofErr w:type="spellStart"/>
-      <w:r>
-        <w:rPr>
-          <w:rFonts w:cs="Calibri"/>
-          <w:i/>
-          <w:iCs/>
-          <w:color w:val="auto"/>
-          <w:lang w:val="es-CL"/>
-        </w:rPr>
-        <w:t>depreciation</w:t>
-      </w:r>
       <w:proofErr w:type="spellEnd"/>
-      <w:r>
-        <w:rPr>
-          <w:rFonts w:cs="Calibri"/>
-          <w:i/>
-          <w:iCs/>
-          <w:color w:val="auto"/>
-          <w:lang w:val="es-CL"/>
-        </w:rPr>
-        <w:t xml:space="preserve"> </w:t>
-      </w:r>
       <w:proofErr w:type="spellStart"/>
-      <w:r>
-        <w:rPr>
-          <w:rFonts w:cs="Calibri"/>
-          <w:i/>
-          <w:iCs/>
-          <w:color w:val="auto"/>
-          <w:lang w:val="es-CL"/>
-        </w:rPr>
-        <w:t>drift</w:t>
-      </w:r>
       <w:proofErr w:type="spellEnd"/>
       <w:r>
-        <w:rPr>
-          <w:rFonts w:cs="Calibri"/>
-          <w:color w:val="auto"/>
-          <w:lang w:val="es-CL"/>
-        </w:rPr>
-        <w:t xml:space="preserve"> (variaciones de comportamiento provocadas por actualizaciones globales del sistema operativo), el proyecto exige el aislamiento perimetral del espacio de trabajo.</w:t>
+        <w:t>Para mitigar el riesgo de colisiones de software y el denominado dependency drift (variaciones de comportamiento provocadas por actualizaciones globales del sistema o de paquetes), el proyecto exige el aislamiento del espacio de trabajo mediante un entorno virtual reproducible.</w:t>
       </w:r>
     </w:p>
     <w:p>
@@ -16394,36 +14261,7 @@
         </w:rPr>
       </w:pPr>
       <w:r>
-        <w:rPr>
-          <w:rFonts w:cs="Calibri"/>
-          <w:color w:val="auto"/>
-          <w:lang w:val="es-CL"/>
-        </w:rPr>
-        <w:t>El pipeline rechaza el uso de librerías genéricas o instalaciones flotantes. El contrato técnico de dependencias se encuentra estrictamente acotado a los componentes científicos esenciales</w:t>
-      </w:r>
-      <w:r>
-        <w:rPr>
-          <w:rFonts w:cs="Calibri"/>
-          <w:color w:val="auto"/>
-          <w:lang w:val="es-CL"/>
-        </w:rPr>
-        <w:t xml:space="preserve"> de </w:t>
-      </w:r>
-      <w:r>
-        <w:rPr>
-          <w:rFonts w:cs="Calibri"/>
-          <w:color w:val="auto"/>
-          <w:lang w:val="es-CL"/>
-        </w:rPr>
-        <w:t>las funciones del script secuencial</w:t>
-      </w:r>
-      <w:r>
-        <w:rPr>
-          <w:rFonts w:cs="Calibri"/>
-          <w:color w:val="auto"/>
-          <w:lang w:val="es-CL"/>
-        </w:rPr>
-        <w:t>.</w:t>
+        <w:t>El pipeline rechaza el uso de librerías genéricas o instalaciones flotantes. El contrato técnico de dependencias se encuentra estrictamente acotado a los componentes efectivamente utilizados en el notebook de Fase 1.</w:t>
       </w:r>
     </w:p>
     <w:p>
@@ -16436,49 +14274,12 @@
           <w:lang w:val="es-CL"/>
         </w:rPr>
       </w:pPr>
-      <w:r>
-        <w:rPr>
-          <w:rFonts w:cs="Calibri"/>
-          <w:color w:val="auto"/>
-          <w:lang w:val="es-CL"/>
-        </w:rPr>
-        <w:t xml:space="preserve">Estas versiones son interrogadas dinámicamente en tiempo de ejecución por el método </w:t>
-      </w:r>
       <w:proofErr w:type="spellStart"/>
-      <w:r>
-        <w:rPr>
-          <w:rFonts w:cs="Calibri"/>
-          <w:color w:val="auto"/>
-          <w:lang w:val="es-CL"/>
-        </w:rPr>
-        <w:t>verificar_entorno_</w:t>
-      </w:r>
       <w:proofErr w:type="gramStart"/>
-      <w:r>
-        <w:rPr>
-          <w:rFonts w:cs="Calibri"/>
-          <w:color w:val="auto"/>
-          <w:lang w:val="es-CL"/>
-        </w:rPr>
-        <w:t>reproducible</w:t>
-      </w:r>
       <w:proofErr w:type="spellEnd"/>
-      <w:r>
-        <w:rPr>
-          <w:rFonts w:cs="Calibri"/>
-          <w:color w:val="auto"/>
-          <w:lang w:val="es-CL"/>
-        </w:rPr>
-        <w:t>(</w:t>
-      </w:r>
       <w:proofErr w:type="gramEnd"/>
       <w:r>
-        <w:rPr>
-          <w:rFonts w:cs="Calibri"/>
-          <w:color w:val="auto"/>
-          <w:lang w:val="es-CL"/>
-        </w:rPr>
-        <w:t>), consolidando la siguiente matriz inmutable de software en el archivo requirements.txt:</w:t>
+        <w:t>Estas versiones son verificadas dinámicamente en tiempo de ejecución dentro del notebook, consolidando la siguiente matriz de software en el archivo requirements.txt:</w:t>
       </w:r>
     </w:p>
     <w:p>
@@ -16646,7 +14447,76 @@
           <w:lang w:val="es-CL"/>
         </w:rPr>
       </w:pPr>
-      <w:r>
+      <w:proofErr w:type="spellStart"/>
+      <w:proofErr w:type="spellEnd"/>
+      <w:proofErr w:type="spellStart"/>
+      <w:proofErr w:type="spellEnd"/>
+      <w:proofErr w:type="spellStart"/>
+      <w:proofErr w:type="spellEnd"/>
+      <w:proofErr w:type="spellStart"/>
+      <w:proofErr w:type="spellEnd"/>
+      <w:r>
+        <w:t>Justificación de la Línea Base: La selección de versiones estables y verificadas, Pandas 2.2.2 y NumPy 1.26.4, asegura coherencia entre el notebook ejecutado, el archivo requirements.txt y el entorno real de trabajo. Estas librerías permiten realizar la carga, inspección y auditoría inicial del dataset clínico de diabetes de manera reproducible, sin incorporar procesos de limpieza, transformación o modelamiento que quedan reservados para fases posteriores.</w:t>
+      </w:r>
+    </w:p>
+    <w:p>
+      <w:pPr>
+        <w:rPr>
+          <w:rFonts w:cs="Calibri"/>
+          <w:color w:val="auto"/>
+          <w:lang w:val="es-CL"/>
+        </w:rPr>
+      </w:pPr>
+    </w:p>
+    <w:p>
+      <w:pPr>
+        <w:pStyle w:val="Ttulo3"/>
+        <w:jc w:val="both"/>
+        <w:rPr>
+          <w:rFonts w:ascii="Calibri" w:hAnsi="Calibri" w:cs="Calibri"/>
+          <w:color w:val="auto"/>
+          <w:lang w:val="es-CL"/>
+        </w:rPr>
+      </w:pPr>
+      <w:bookmarkStart w:id="25" w:name="_Toc232773744"/>
+      <w:r>
+        <w:rPr>
+          <w:rFonts w:ascii="Calibri" w:hAnsi="Calibri" w:cs="Calibri"/>
+          <w:color w:val="auto"/>
+          <w:lang w:val="es-CL"/>
+        </w:rPr>
+        <w:lastRenderedPageBreak/>
+        <w:t>4</w:t>
+      </w:r>
+      <w:r>
+        <w:rPr>
+          <w:rFonts w:ascii="Calibri" w:hAnsi="Calibri" w:cs="Calibri"/>
+          <w:color w:val="auto"/>
+          <w:lang w:val="es-CL"/>
+        </w:rPr>
+        <w:t>.3. Instrucciones de Despliegue y Comandos Base de Reproducibilidad</w:t>
+      </w:r>
+      <w:bookmarkEnd w:id="25"/>
+    </w:p>
+    <w:p>
+      <w:pPr>
+        <w:ind w:firstLine="720"/>
+        <w:jc w:val="both"/>
+        <w:rPr>
+          <w:rFonts w:cs="Calibri"/>
+          <w:color w:val="auto"/>
+          <w:lang w:val="es-CL"/>
+        </w:rPr>
+      </w:pPr>
+      <w:proofErr w:type="spellStart"/>
+      <w:proofErr w:type="spellEnd"/>
+      <w:r>
+        <w:t>Para reconstruir el entorno científico de forma automatizada desde una terminal, se define el siguiente protocolo de comandos secuenciales, alineado con el README de Fase 1 y con el archivo requirements.txt actualizado:</w:t>
+      </w:r>
+    </w:p>
+    <w:p>
+      <w:pPr>
+        <w:jc w:val="both"/>
         <w:rPr>
           <w:rFonts w:cs="Calibri"/>
           <w:b/>
@@ -16654,36 +14524,38 @@
           <w:color w:val="auto"/>
           <w:lang w:val="es-CL"/>
         </w:rPr>
-        <w:t>Justificación de la Línea Base:</w:t>
-      </w:r>
-      <w:r>
-        <w:rPr>
-          <w:rFonts w:cs="Calibri"/>
-          <w:color w:val="auto"/>
-          <w:lang w:val="es-CL"/>
-        </w:rPr>
-        <w:t xml:space="preserve"> La selección explícita de las arquitecturas modernas de Pandas 3.x y </w:t>
-      </w:r>
+      </w:pPr>
+      <w:r>
+        <w:rPr>
+          <w:rFonts w:cs="Calibri"/>
+          <w:b/>
+          <w:bCs/>
+          <w:color w:val="auto"/>
+          <w:lang w:val="es-CL"/>
+        </w:rPr>
+        <w:t>Paso 1: Clonación y Ubicación en el Repositorio Base</w:t>
+      </w:r>
+    </w:p>
+    <w:p>
+      <w:pPr>
+        <w:ind w:firstLine="720"/>
+        <w:jc w:val="both"/>
+        <w:rPr>
+          <w:rFonts w:cs="Calibri"/>
+          <w:color w:val="auto"/>
+          <w:lang w:val="es-CL"/>
+        </w:rPr>
+      </w:pPr>
       <w:proofErr w:type="spellStart"/>
-      <w:r>
-        <w:rPr>
-          <w:rFonts w:cs="Calibri"/>
-          <w:color w:val="auto"/>
-          <w:lang w:val="es-CL"/>
-        </w:rPr>
-        <w:t>NumPy</w:t>
-      </w:r>
       <w:proofErr w:type="spellEnd"/>
       <w:r>
-        <w:rPr>
-          <w:rFonts w:cs="Calibri"/>
-          <w:color w:val="auto"/>
-          <w:lang w:val="es-CL"/>
-        </w:rPr>
-        <w:t xml:space="preserve"> 2.x asegura la optimización en el manejo de vectores contiguos en memoria RAM y previene alertas de depreciación (</w:t>
-      </w:r>
-      <w:proofErr w:type="spellStart"/>
-      <w:r>
+        <w:t>Clonar el repositorio oficial del equipo e ingresar a la carpeta de Fase 1:</w:t>
+      </w:r>
+    </w:p>
+    <w:p>
+      <w:pPr>
+        <w:spacing w:after="0"/>
+        <w:jc w:val="both"/>
         <w:rPr>
           <w:rFonts w:cs="Calibri"/>
           <w:i/>
@@ -16691,9 +14563,7 @@
           <w:color w:val="auto"/>
           <w:lang w:val="es-CL"/>
         </w:rPr>
-        <w:t>deprecation</w:t>
-      </w:r>
-      <w:proofErr w:type="spellEnd"/>
+      </w:pPr>
       <w:r>
         <w:rPr>
           <w:rFonts w:cs="Calibri"/>
@@ -16702,9 +14572,8 @@
           <w:color w:val="auto"/>
           <w:lang w:val="es-CL"/>
         </w:rPr>
-        <w:t xml:space="preserve"> </w:t>
-      </w:r>
-      <w:proofErr w:type="spellStart"/>
+        <w:t>Bash</w:t>
+      </w:r>
       <w:r>
         <w:rPr>
           <w:rFonts w:cs="Calibri"/>
@@ -16713,74 +14582,41 @@
           <w:color w:val="auto"/>
           <w:lang w:val="es-CL"/>
         </w:rPr>
-        <w:t>warnings</w:t>
-      </w:r>
+        <w:t>:</w:t>
+      </w:r>
+    </w:p>
+    <w:p>
+      <w:pPr>
+        <w:spacing w:after="0"/>
+        <w:jc w:val="both"/>
+        <w:rPr>
+          <w:rFonts w:cs="Calibri"/>
+          <w:i/>
+          <w:iCs/>
+          <w:color w:val="auto"/>
+          <w:lang w:val="es-CL"/>
+        </w:rPr>
+      </w:pPr>
+      <w:proofErr w:type="spellStart"/>
       <w:proofErr w:type="spellEnd"/>
       <w:r>
-        <w:rPr>
-          <w:rFonts w:cs="Calibri"/>
-          <w:color w:val="auto"/>
-          <w:lang w:val="es-CL"/>
-        </w:rPr>
-        <w:t xml:space="preserve">) al procesar las estructuras de datos clínicos del </w:t>
-      </w:r>
-      <w:proofErr w:type="spellStart"/>
-      <w:r>
-        <w:rPr>
-          <w:rFonts w:cs="Calibri"/>
-          <w:color w:val="auto"/>
-          <w:lang w:val="es-CL"/>
-        </w:rPr>
-        <w:t>dataset</w:t>
-      </w:r>
-      <w:proofErr w:type="spellEnd"/>
-      <w:r>
-        <w:rPr>
-          <w:rFonts w:cs="Calibri"/>
-          <w:color w:val="auto"/>
-          <w:lang w:val="es-CL"/>
-        </w:rPr>
-        <w:t xml:space="preserve"> de diabetes.</w:t>
-      </w:r>
-    </w:p>
-    <w:p>
-      <w:pPr>
-        <w:rPr>
-          <w:rFonts w:cs="Calibri"/>
-          <w:color w:val="auto"/>
-          <w:lang w:val="es-CL"/>
-        </w:rPr>
-      </w:pPr>
-    </w:p>
-    <w:p>
-      <w:pPr>
-        <w:pStyle w:val="Ttulo3"/>
+        <w:t>git clone https://github.com/edocontreras/mcdia500-programacion-cd-g6.git &amp;&amp; cd mcdia500-programacion-cd-g6/F1</w:t>
+      </w:r>
+    </w:p>
+    <w:p>
+      <w:pPr>
         <w:jc w:val="both"/>
         <w:rPr>
-          <w:rFonts w:ascii="Calibri" w:hAnsi="Calibri" w:cs="Calibri"/>
-          <w:color w:val="auto"/>
-          <w:lang w:val="es-CL"/>
-        </w:rPr>
-      </w:pPr>
-      <w:bookmarkStart w:id="25" w:name="_Toc232773744"/>
-      <w:r>
-        <w:rPr>
-          <w:rFonts w:ascii="Calibri" w:hAnsi="Calibri" w:cs="Calibri"/>
-          <w:color w:val="auto"/>
-          <w:lang w:val="es-CL"/>
-        </w:rPr>
-        <w:lastRenderedPageBreak/>
-        <w:t>4</w:t>
-      </w:r>
-      <w:r>
-        <w:rPr>
-          <w:rFonts w:ascii="Calibri" w:hAnsi="Calibri" w:cs="Calibri"/>
-          <w:color w:val="auto"/>
-          <w:lang w:val="es-CL"/>
-        </w:rPr>
-        <w:t>.3. Instrucciones de Despliegue y Comandos Base de Reproducibilidad</w:t>
-      </w:r>
-      <w:bookmarkEnd w:id="25"/>
+          <w:rFonts w:cs="Calibri"/>
+          <w:b/>
+          <w:bCs/>
+          <w:color w:val="auto"/>
+          <w:lang w:val="es-CL"/>
+        </w:rPr>
+      </w:pPr>
+      <w:r>
+        <w:t>Paso 2: Creación y aislamiento del entorno virtual</w:t>
+      </w:r>
     </w:p>
     <w:p>
       <w:pPr>
@@ -16793,216 +14629,7 @@
         </w:rPr>
       </w:pPr>
       <w:r>
-        <w:rPr>
-          <w:rFonts w:cs="Calibri"/>
-          <w:color w:val="auto"/>
-          <w:lang w:val="es-CL"/>
-        </w:rPr>
-        <w:t>Para reconstruir el entorno científico de forma automatizada e idempotente</w:t>
-      </w:r>
-      <w:r>
-        <w:rPr>
-          <w:rStyle w:val="Refdenotaalpie"/>
-          <w:rFonts w:cs="Calibri"/>
-          <w:color w:val="auto"/>
-          <w:lang w:val="es-CL"/>
-        </w:rPr>
-        <w:footnoteReference w:id="9"/>
-      </w:r>
-      <w:r>
-        <w:rPr>
-          <w:rFonts w:cs="Calibri"/>
-          <w:color w:val="auto"/>
-          <w:lang w:val="es-CL"/>
-        </w:rPr>
-        <w:t xml:space="preserve"> desde cualquier terminal (Anaconda </w:t>
-      </w:r>
-      <w:proofErr w:type="spellStart"/>
-      <w:r>
-        <w:rPr>
-          <w:rFonts w:cs="Calibri"/>
-          <w:color w:val="auto"/>
-          <w:lang w:val="es-CL"/>
-        </w:rPr>
-        <w:t>Prompt</w:t>
-      </w:r>
-      <w:proofErr w:type="spellEnd"/>
-      <w:r>
-        <w:rPr>
-          <w:rFonts w:cs="Calibri"/>
-          <w:color w:val="auto"/>
-          <w:lang w:val="es-CL"/>
-        </w:rPr>
-        <w:t xml:space="preserve"> o consola del sistema), se define el siguiente protocolo de comandos secuenciales:</w:t>
-      </w:r>
-    </w:p>
-    <w:p>
-      <w:pPr>
-        <w:jc w:val="both"/>
-        <w:rPr>
-          <w:rFonts w:cs="Calibri"/>
-          <w:b/>
-          <w:bCs/>
-          <w:color w:val="auto"/>
-          <w:lang w:val="es-CL"/>
-        </w:rPr>
-      </w:pPr>
-      <w:r>
-        <w:rPr>
-          <w:rFonts w:cs="Calibri"/>
-          <w:b/>
-          <w:bCs/>
-          <w:color w:val="auto"/>
-          <w:lang w:val="es-CL"/>
-        </w:rPr>
-        <w:t>Paso 1: Clonación y Ubicación en el Repositorio Base</w:t>
-      </w:r>
-    </w:p>
-    <w:p>
-      <w:pPr>
-        <w:ind w:firstLine="720"/>
-        <w:jc w:val="both"/>
-        <w:rPr>
-          <w:rFonts w:cs="Calibri"/>
-          <w:color w:val="auto"/>
-          <w:lang w:val="es-CL"/>
-        </w:rPr>
-      </w:pPr>
-      <w:r>
-        <w:rPr>
-          <w:rFonts w:cs="Calibri"/>
-          <w:color w:val="auto"/>
-          <w:lang w:val="es-CL"/>
-        </w:rPr>
-        <w:t xml:space="preserve">Desplazarse hacia el directorio raíz del proyecto donde se </w:t>
-      </w:r>
-      <w:proofErr w:type="spellStart"/>
-      <w:r>
-        <w:rPr>
-          <w:rFonts w:cs="Calibri"/>
-          <w:color w:val="auto"/>
-          <w:lang w:val="es-CL"/>
-        </w:rPr>
-        <w:t>co-localizan</w:t>
-      </w:r>
-      <w:proofErr w:type="spellEnd"/>
-      <w:r>
-        <w:rPr>
-          <w:rFonts w:cs="Calibri"/>
-          <w:color w:val="auto"/>
-          <w:lang w:val="es-CL"/>
-        </w:rPr>
-        <w:t xml:space="preserve"> el cuaderno, el código fuente y el archivo de dependencias:</w:t>
-      </w:r>
-    </w:p>
-    <w:p>
-      <w:pPr>
-        <w:spacing w:after="0"/>
-        <w:jc w:val="both"/>
-        <w:rPr>
-          <w:rFonts w:cs="Calibri"/>
-          <w:i/>
-          <w:iCs/>
-          <w:color w:val="auto"/>
-          <w:lang w:val="es-CL"/>
-        </w:rPr>
-      </w:pPr>
-      <w:r>
-        <w:rPr>
-          <w:rFonts w:cs="Calibri"/>
-          <w:i/>
-          <w:iCs/>
-          <w:color w:val="auto"/>
-          <w:lang w:val="es-CL"/>
-        </w:rPr>
-        <w:t>Bash</w:t>
-      </w:r>
-      <w:r>
-        <w:rPr>
-          <w:rFonts w:cs="Calibri"/>
-          <w:i/>
-          <w:iCs/>
-          <w:color w:val="auto"/>
-          <w:lang w:val="es-CL"/>
-        </w:rPr>
-        <w:t>:</w:t>
-      </w:r>
-    </w:p>
-    <w:p>
-      <w:pPr>
-        <w:spacing w:after="0"/>
-        <w:jc w:val="both"/>
-        <w:rPr>
-          <w:rFonts w:cs="Calibri"/>
-          <w:i/>
-          <w:iCs/>
-          <w:color w:val="auto"/>
-          <w:lang w:val="es-CL"/>
-        </w:rPr>
-      </w:pPr>
-      <w:r>
-        <w:rPr>
-          <w:rFonts w:cs="Calibri"/>
-          <w:i/>
-          <w:iCs/>
-          <w:color w:val="auto"/>
-          <w:lang w:val="es-CL"/>
-        </w:rPr>
-        <w:tab/>
-        <w:t>cd /ruta/a/tu/</w:t>
-      </w:r>
-      <w:proofErr w:type="spellStart"/>
-      <w:r>
-        <w:rPr>
-          <w:rFonts w:cs="Calibri"/>
-          <w:i/>
-          <w:iCs/>
-          <w:color w:val="auto"/>
-          <w:lang w:val="es-CL"/>
-        </w:rPr>
-        <w:t>repository-root</w:t>
-      </w:r>
-      <w:proofErr w:type="spellEnd"/>
-    </w:p>
-    <w:p>
-      <w:pPr>
-        <w:jc w:val="both"/>
-        <w:rPr>
-          <w:rFonts w:cs="Calibri"/>
-          <w:b/>
-          <w:bCs/>
-          <w:color w:val="auto"/>
-          <w:lang w:val="es-CL"/>
-        </w:rPr>
-      </w:pPr>
-      <w:r>
-        <w:rPr>
-          <w:rFonts w:cs="Calibri"/>
-          <w:b/>
-          <w:bCs/>
-          <w:color w:val="auto"/>
-          <w:lang w:val="es-CL"/>
-        </w:rPr>
-        <w:t>Paso 2: Creación y Aislamiento del Entorno con Anaconda</w:t>
-      </w:r>
-    </w:p>
-    <w:p>
-      <w:pPr>
-        <w:ind w:firstLine="720"/>
-        <w:jc w:val="both"/>
-        <w:rPr>
-          <w:rFonts w:cs="Calibri"/>
-          <w:color w:val="auto"/>
-          <w:lang w:val="es-CL"/>
-        </w:rPr>
-      </w:pPr>
-      <w:r>
-        <w:rPr>
-          <w:rFonts w:cs="Calibri"/>
-          <w:color w:val="auto"/>
-          <w:lang w:val="es-CL"/>
-        </w:rPr>
-        <w:t>Instanciar un nuevo entorno virtual limpio, forzando la versión exacta del intérprete técnico:</w:t>
+        <w:t>Crear un entorno virtual limpio con Python y activarlo según la terminal utilizada:</w:t>
       </w:r>
     </w:p>
     <w:p>
@@ -17042,7 +14669,7 @@
         </w:rPr>
       </w:pPr>
       <w:r>
-        <w:t>conda create --name diabetes_fase1 python=3.12.4 -y</w:t>
+        <w:t>python -m venv .venv</w:t>
       </w:r>
     </w:p>
     <w:p>
@@ -17057,14 +14684,7 @@
         </w:rPr>
       </w:pPr>
       <w:r>
-        <w:rPr>
-          <w:rFonts w:cs="Calibri"/>
-          <w:b/>
-          <w:bCs/>
-          <w:color w:val="auto"/>
-          <w:lang w:val="es-CL"/>
-        </w:rPr>
-        <w:t>Paso 3: Activación del Espacio de Trabajo</w:t>
+        <w:t>Paso 3: Activación del espacio de trabajo</w:t>
       </w:r>
     </w:p>
     <w:p>
@@ -17078,12 +14698,7 @@
         </w:rPr>
       </w:pPr>
       <w:r>
-        <w:rPr>
-          <w:rFonts w:cs="Calibri"/>
-          <w:color w:val="auto"/>
-          <w:lang w:val="es-CL"/>
-        </w:rPr>
-        <w:t>Habilitar el entorno aislado en la sesión de la terminal activa:</w:t>
+        <w:t>Activar el entorno virtual en Windows PowerShell o CMD:</w:t>
       </w:r>
     </w:p>
     <w:p>
@@ -17123,48 +14738,11 @@
         </w:rPr>
       </w:pPr>
       <w:proofErr w:type="spellStart"/>
-      <w:r>
-        <w:rPr>
-          <w:rFonts w:cs="Calibri"/>
-          <w:i/>
-          <w:iCs/>
-          <w:color w:val="auto"/>
-          <w:lang w:val="es-CL"/>
-        </w:rPr>
-        <w:t>conda</w:t>
-      </w:r>
       <w:proofErr w:type="spellEnd"/>
-      <w:r>
-        <w:rPr>
-          <w:rFonts w:cs="Calibri"/>
-          <w:i/>
-          <w:iCs/>
-          <w:color w:val="auto"/>
-          <w:lang w:val="es-CL"/>
-        </w:rPr>
-        <w:t xml:space="preserve"> </w:t>
-      </w:r>
       <w:proofErr w:type="spellStart"/>
-      <w:r>
-        <w:rPr>
-          <w:rFonts w:cs="Calibri"/>
-          <w:i/>
-          <w:iCs/>
-          <w:color w:val="auto"/>
-          <w:lang w:val="es-CL"/>
-        </w:rPr>
-        <w:t>activate</w:t>
-      </w:r>
       <w:proofErr w:type="spellEnd"/>
       <w:r>
-        <w:rPr>
-          <w:rFonts w:cs="Calibri"/>
-          <w:i/>
-          <w:iCs/>
-          <w:color w:val="auto"/>
-          <w:lang w:val="es-CL"/>
-        </w:rPr>
-        <w:t xml:space="preserve"> diabetes_fase1</w:t>
+        <w:t>.venv\Scripts\Activate.ps1</w:t>
       </w:r>
     </w:p>
     <w:p>
@@ -17179,14 +14757,7 @@
         </w:rPr>
       </w:pPr>
       <w:r>
-        <w:rPr>
-          <w:rFonts w:cs="Calibri"/>
-          <w:b/>
-          <w:bCs/>
-          <w:color w:val="auto"/>
-          <w:lang w:val="es-CL"/>
-        </w:rPr>
-        <w:t>Paso 4: Inyección del Contrato de Dependencias</w:t>
+        <w:t>Paso 4: Instalación del contrato de dependencias</w:t>
       </w:r>
     </w:p>
     <w:p>
@@ -17200,12 +14771,7 @@
         </w:rPr>
       </w:pPr>
       <w:r>
-        <w:rPr>
-          <w:rFonts w:cs="Calibri"/>
-          <w:color w:val="auto"/>
-          <w:lang w:val="es-CL"/>
-        </w:rPr>
-        <w:t>Ejecutar la instalación masiva y determinista de la suite científica anclada, evitando actualizaciones automáticas de terceros:</w:t>
+        <w:t>Actualizar pip e instalar las dependencias fijadas en requirements.txt:</w:t>
       </w:r>
     </w:p>
     <w:p>
@@ -17241,34 +14807,10 @@
           <w:color w:val="auto"/>
         </w:rPr>
       </w:pPr>
-      <w:r>
-        <w:rPr>
-          <w:rFonts w:cs="Calibri"/>
-          <w:i/>
-          <w:iCs/>
-          <w:color w:val="auto"/>
-        </w:rPr>
-        <w:t>pip install --no-cache-</w:t>
-      </w:r>
       <w:proofErr w:type="spellStart"/>
-      <w:r>
-        <w:rPr>
-          <w:rFonts w:cs="Calibri"/>
-          <w:i/>
-          <w:iCs/>
-          <w:color w:val="auto"/>
-        </w:rPr>
-        <w:t>dir</w:t>
-      </w:r>
       <w:proofErr w:type="spellEnd"/>
       <w:r>
-        <w:rPr>
-          <w:rFonts w:cs="Calibri"/>
-          <w:i/>
-          <w:iCs/>
-          <w:color w:val="auto"/>
-        </w:rPr>
-        <w:t xml:space="preserve"> -r requirements.txt</w:t>
+        <w:t>python -m pip install --upgrade pip &amp;&amp; python -m pip install -r requirements.txt</w:t>
       </w:r>
     </w:p>
     <w:p>
@@ -17283,14 +14825,7 @@
         </w:rPr>
       </w:pPr>
       <w:r>
-        <w:rPr>
-          <w:rFonts w:cs="Calibri"/>
-          <w:b/>
-          <w:bCs/>
-          <w:color w:val="auto"/>
-          <w:lang w:val="es-CL"/>
-        </w:rPr>
-        <w:t>Paso 5: Inicialización del Orquestador Científico</w:t>
+        <w:t>Paso 5: Registro del kernel y apertura de JupyterLab</w:t>
       </w:r>
     </w:p>
     <w:p>
@@ -17304,12 +14839,7 @@
         </w:rPr>
       </w:pPr>
       <w:r>
-        <w:rPr>
-          <w:rFonts w:cs="Calibri"/>
-          <w:color w:val="auto"/>
-          <w:lang w:val="es-CL"/>
-        </w:rPr>
-        <w:t>Lanzar la interfaz del servidor para iniciar la auditoría visual:</w:t>
+        <w:t>Registrar el kernel de trabajo y lanzar JupyterLab para ejecutar el notebook:</w:t>
       </w:r>
     </w:p>
     <w:p>
@@ -17349,26 +14879,9 @@
         </w:rPr>
       </w:pPr>
       <w:proofErr w:type="spellStart"/>
-      <w:r>
-        <w:rPr>
-          <w:rFonts w:cs="Calibri"/>
-          <w:i/>
-          <w:iCs/>
-          <w:color w:val="auto"/>
-          <w:lang w:val="es-CL"/>
-        </w:rPr>
-        <w:t>jupyter</w:t>
-      </w:r>
       <w:proofErr w:type="spellEnd"/>
       <w:r>
-        <w:rPr>
-          <w:rFonts w:cs="Calibri"/>
-          <w:i/>
-          <w:iCs/>
-          <w:color w:val="auto"/>
-          <w:lang w:val="es-CL"/>
-        </w:rPr>
-        <w:t xml:space="preserve"> notebook</w:t>
+        <w:t>python -m ipykernel install --user --name mcdia500-f1-g6 --display-name "Python 3.12.4 - MCDIA500 F1 G6" &amp;&amp; python -m jupyterlab</w:t>
       </w:r>
     </w:p>
     <w:p>

</xml_diff>